<commit_message>
Realização da página de formulário e ajustes na documentação
</commit_message>
<xml_diff>
--- a/artefatos/Documentacao.docx
+++ b/artefatos/Documentacao.docx
@@ -235,14 +235,210 @@
     </w:p>
     <w:p>
       <w:pPr>
-        <w:spacing w:after="0" w:line="240" w:lineRule="auto"/>
-        <w:rPr>
-          <w:rFonts w:ascii="Times New Roman" w:eastAsia="Times New Roman" w:hAnsi="Times New Roman" w:cs="Times New Roman"/>
-          <w:sz w:val="24"/>
-          <w:szCs w:val="24"/>
-          <w:lang w:eastAsia="pt-BR"/>
-        </w:rPr>
-      </w:pPr>
+        <w:pStyle w:val="NormalWeb"/>
+      </w:pPr>
+      <w:r>
+        <w:t xml:space="preserve">O envolvimento com o Clube de Desbravadores </w:t>
+      </w:r>
+      <w:r>
+        <w:t>foi</w:t>
+      </w:r>
+      <w:r>
+        <w:t xml:space="preserve"> resultado natural de uma criação permeada pelos valores da Igreja Adventista do Sétimo Dia. Desde pequeno, </w:t>
+      </w:r>
+      <w:r>
+        <w:t>minha</w:t>
+      </w:r>
+      <w:r>
+        <w:t xml:space="preserve"> família sempre incentivou a participação ativa nas atividades da igreja, e o clube era algo que a minha mãe amava profundamente. Assim que atingi a idade mínima exigida, ingressei no clube sem hesitar, motivado tanto pelo exemplo familiar quanto pela vontade de pertencer a algo maior.</w:t>
+      </w:r>
+    </w:p>
+    <w:p>
+      <w:pPr>
+        <w:pStyle w:val="NormalWeb"/>
+      </w:pPr>
+      <w:r>
+        <w:t xml:space="preserve">Hoje, o ministério dos Desbravadores não é apenas uma lembrança da infância, mas uma presença constante e ativa no meu cotidiano. Como diretor do ministério, cada dia traz novas responsabilidades e decisões a serem tomadas. Foi justamente por meio dessa experiência que construí grande parte do meu caráter e dos valores que me </w:t>
+      </w:r>
+      <w:r>
+        <w:t>acompanham</w:t>
+      </w:r>
+      <w:r>
+        <w:t xml:space="preserve"> até hoje.</w:t>
+      </w:r>
+    </w:p>
+    <w:p>
+      <w:pPr>
+        <w:pStyle w:val="NormalWeb"/>
+      </w:pPr>
+      <w:r>
+        <w:t>O Clube de Desbravadores foi, e continua sendo, uma escola d</w:t>
+      </w:r>
+      <w:r>
+        <w:t>a</w:t>
+      </w:r>
+      <w:r>
+        <w:t xml:space="preserve"> vida. Entre os muitos ensinamentos absorvidos, destacam-se valores que se tornaram pilares da minha identidade: a </w:t>
+      </w:r>
+      <w:r>
+        <w:rPr>
+          <w:rStyle w:val="Forte"/>
+          <w:b w:val="0"/>
+        </w:rPr>
+        <w:t>liderança</w:t>
+      </w:r>
+      <w:r>
+        <w:t xml:space="preserve">, desenvolvida na condução de </w:t>
+      </w:r>
+      <w:r>
+        <w:t>unidades e clubes</w:t>
+      </w:r>
+      <w:r>
+        <w:t xml:space="preserve">; a </w:t>
+      </w:r>
+      <w:r>
+        <w:rPr>
+          <w:rStyle w:val="Forte"/>
+          <w:b w:val="0"/>
+        </w:rPr>
+        <w:t>disciplina</w:t>
+      </w:r>
+      <w:r>
+        <w:t xml:space="preserve">, construída pela rotina de compromissos; e a </w:t>
+      </w:r>
+      <w:r>
+        <w:rPr>
+          <w:rStyle w:val="Forte"/>
+          <w:b w:val="0"/>
+        </w:rPr>
+        <w:t>responsabilidade</w:t>
+      </w:r>
+      <w:r>
+        <w:t xml:space="preserve">, cultivada desde cedo ao assumir tarefas que impactavam outras pessoas. A </w:t>
+      </w:r>
+      <w:r>
+        <w:rPr>
+          <w:rStyle w:val="Forte"/>
+          <w:b w:val="0"/>
+        </w:rPr>
+        <w:t>fé</w:t>
+      </w:r>
+      <w:r>
+        <w:t xml:space="preserve"> sempre esteve presente como alicerce espiritual. A </w:t>
+      </w:r>
+      <w:r>
+        <w:rPr>
+          <w:rStyle w:val="Forte"/>
+          <w:b w:val="0"/>
+        </w:rPr>
+        <w:t>autoestima</w:t>
+      </w:r>
+      <w:r>
+        <w:t xml:space="preserve"> e a </w:t>
+      </w:r>
+      <w:r>
+        <w:rPr>
+          <w:rStyle w:val="Forte"/>
+          <w:b w:val="0"/>
+        </w:rPr>
+        <w:t>confiança</w:t>
+      </w:r>
+      <w:r>
+        <w:t xml:space="preserve"> foram fortalecidas pelas conquistas alcançadas no clube. Por fim, a </w:t>
+      </w:r>
+      <w:r>
+        <w:rPr>
+          <w:rStyle w:val="Forte"/>
+          <w:b w:val="0"/>
+        </w:rPr>
+        <w:t>comunicação</w:t>
+      </w:r>
+      <w:r>
+        <w:t xml:space="preserve"> foi sendo aprimorada através de apresentações e interações com diferentes públicos. Todos esses valores compõem a essência do meu desafio individual.</w:t>
+      </w:r>
+      <w:bookmarkStart w:id="0" w:name="_GoBack"/>
+      <w:bookmarkEnd w:id="0"/>
+    </w:p>
+    <w:p>
+      <w:pPr>
+        <w:pStyle w:val="NormalWeb"/>
+      </w:pPr>
+      <w:r>
+        <w:t xml:space="preserve">Entre os obstáculos enfrentados, a gestão do tempo foi, sem dúvida, o maior deles. Por convicção religiosa, o sábado é reservado ao descanso e à </w:t>
+      </w:r>
+      <w:r>
+        <w:t>Deus</w:t>
+      </w:r>
+      <w:r>
+        <w:t xml:space="preserve">, o que significa que tenho um dia a menos do que a maioria das pessoas para cumprir obrigações acadêmicas e profissionais. Essa realidade exige organização rigorosa e </w:t>
+      </w:r>
+      <w:r>
+        <w:t xml:space="preserve">fundamentalmente a </w:t>
+      </w:r>
+      <w:r>
+        <w:lastRenderedPageBreak/>
+        <w:t>disciplina. Curiosamente, essa limitação acabou se tornando um reflexo direto de um dos valores mais presentes na minha trajetória</w:t>
+      </w:r>
+      <w:r>
+        <w:t xml:space="preserve">, </w:t>
+      </w:r>
+      <w:r>
+        <w:t>a disciplina, aprendida dentro do próprio clube.</w:t>
+      </w:r>
+    </w:p>
+    <w:p>
+      <w:pPr>
+        <w:pStyle w:val="NormalWeb"/>
+      </w:pPr>
+      <w:r>
+        <w:t>Chegar até aqui representa, por si só, a maior superação desta jornada. Desde cedo, fui alguém sobre quem recaíam responsabilidades</w:t>
+      </w:r>
+      <w:r>
+        <w:t xml:space="preserve">, </w:t>
+      </w:r>
+      <w:r>
+        <w:t>no clube, na família, na vida acadêmica. Concluir os projetos, obter bons resultados nas avaliações e garantir a aprovação para o próximo semestre são conquistas que representam</w:t>
+      </w:r>
+      <w:r>
+        <w:t xml:space="preserve"> e irão representar</w:t>
+      </w:r>
+      <w:r>
+        <w:t xml:space="preserve"> a prova de que é possível equilibrar fé, compromisso, liderança e estudo sem abrir mão de nenhum deles.</w:t>
+      </w:r>
+    </w:p>
+    <w:p>
+      <w:pPr>
+        <w:pStyle w:val="NormalWeb"/>
+      </w:pPr>
+      <w:r>
+        <w:t xml:space="preserve">Ao olhar para tudo que foi conquistado, é impossível não reconhecer que essa trajetória não foi percorrida sozinha. A primeira presença fundamental foi </w:t>
+      </w:r>
+      <w:r>
+        <w:rPr>
+          <w:rStyle w:val="Forte"/>
+          <w:b w:val="0"/>
+        </w:rPr>
+        <w:t>Deus</w:t>
+      </w:r>
+      <w:r>
+        <w:t xml:space="preserve">, em quem encontrei força e direção em cada etapa. A segunda foi </w:t>
+      </w:r>
+      <w:r>
+        <w:rPr>
+          <w:rStyle w:val="Forte"/>
+          <w:b w:val="0"/>
+        </w:rPr>
+        <w:t>minha mãe</w:t>
+      </w:r>
+      <w:r>
+        <w:t>, que esteve ao meu lado com amor e apoio incondicional</w:t>
+      </w:r>
+      <w:r>
+        <w:t xml:space="preserve">, </w:t>
+      </w:r>
+      <w:r>
+        <w:t>foi ela quem primeiro despertou em mim o amor pelo Clube de Desbravadores. A ela e a Deus, toda a minha gratidão.</w:t>
+      </w:r>
     </w:p>
     <w:p>
       <w:pPr>
@@ -445,16 +641,7 @@
           <w:sz w:val="24"/>
           <w:szCs w:val="24"/>
         </w:rPr>
-        <w:t xml:space="preserve">Do ponto de vista acadêmico, o projeto também se justifica pela oportunidade de aplicar, de maneira integrada, os conteúdos estudados nas disciplinas do curso, como </w:t>
-      </w:r>
-      <w:r>
-        <w:rPr>
-          <w:rFonts w:ascii="Times New Roman" w:hAnsi="Times New Roman" w:cs="Times New Roman"/>
-          <w:sz w:val="24"/>
-          <w:szCs w:val="24"/>
-        </w:rPr>
-        <w:lastRenderedPageBreak/>
-        <w:t>modelagem de banco de dados, desenvolvimento de algoritmos, uso de ferramentas de versionamento, planejamento de projeto e utilização de ambientes Linux. Dessa forma, além de atender aos requisitos acadêmicos, o sistema desenvolvido permitirá colocar em prática conhecimentos técnicos em um contexto significativo e próximo da realidade, podendo ainda servir como base para futuras melhorias e aplicações reais em ambientes semelhantes.</w:t>
+        <w:t>Do ponto de vista acadêmico, o projeto também se justifica pela oportunidade de aplicar, de maneira integrada, os conteúdos estudados nas disciplinas do curso, como modelagem de banco de dados, desenvolvimento de algoritmos, uso de ferramentas de versionamento, planejamento de projeto e utilização de ambientes Linux. Dessa forma, além de atender aos requisitos acadêmicos, o sistema desenvolvido permitirá colocar em prática conhecimentos técnicos em um contexto significativo e próximo da realidade, podendo ainda servir como base para futuras melhorias e aplicações reais em ambientes semelhantes.</w:t>
       </w:r>
     </w:p>
     <w:p>
@@ -497,6 +684,7 @@
           <w:b/>
           <w:lang w:eastAsia="pt-BR"/>
         </w:rPr>
+        <w:lastRenderedPageBreak/>
         <w:t>3.1 Descrição resumida</w:t>
       </w:r>
     </w:p>
@@ -825,7 +1013,6 @@
           <w:b/>
           <w:lang w:eastAsia="pt-BR"/>
         </w:rPr>
-        <w:lastRenderedPageBreak/>
         <w:t>3.3</w:t>
       </w:r>
       <w:r>
@@ -959,6 +1146,7 @@
           <w:sz w:val="24"/>
           <w:szCs w:val="24"/>
         </w:rPr>
+        <w:lastRenderedPageBreak/>
         <w:t xml:space="preserve">O sistema deve possuir um </w:t>
       </w:r>
       <w:r>
@@ -1463,35 +1651,36 @@
           <w:b/>
           <w:lang w:eastAsia="pt-BR"/>
         </w:rPr>
+        <w:t xml:space="preserve">3.4 </w:t>
+      </w:r>
+      <w:r>
+        <w:rPr>
+          <w:rFonts w:ascii="Times New Roman" w:eastAsia="Times New Roman" w:hAnsi="Times New Roman" w:cs="Times New Roman"/>
+          <w:b/>
+          <w:lang w:eastAsia="pt-BR"/>
+        </w:rPr>
+        <w:t>Macro cronograma</w:t>
+      </w:r>
+    </w:p>
+    <w:p>
+      <w:pPr>
+        <w:rPr>
+          <w:lang w:eastAsia="pt-BR"/>
+        </w:rPr>
+      </w:pPr>
+    </w:p>
+    <w:p>
+      <w:pPr>
+        <w:rPr>
+          <w:lang w:eastAsia="pt-BR"/>
+        </w:rPr>
+      </w:pPr>
+      <w:r>
+        <w:rPr>
+          <w:noProof/>
+          <w:lang w:eastAsia="pt-BR"/>
+        </w:rPr>
         <w:lastRenderedPageBreak/>
-        <w:t xml:space="preserve">3.4 </w:t>
-      </w:r>
-      <w:r>
-        <w:rPr>
-          <w:rFonts w:ascii="Times New Roman" w:eastAsia="Times New Roman" w:hAnsi="Times New Roman" w:cs="Times New Roman"/>
-          <w:b/>
-          <w:lang w:eastAsia="pt-BR"/>
-        </w:rPr>
-        <w:t>Macro cronograma</w:t>
-      </w:r>
-    </w:p>
-    <w:p>
-      <w:pPr>
-        <w:rPr>
-          <w:lang w:eastAsia="pt-BR"/>
-        </w:rPr>
-      </w:pPr>
-    </w:p>
-    <w:p>
-      <w:pPr>
-        <w:rPr>
-          <w:lang w:eastAsia="pt-BR"/>
-        </w:rPr>
-      </w:pPr>
-      <w:r>
-        <w:rPr>
-          <w:lang w:eastAsia="pt-BR"/>
-        </w:rPr>
         <w:drawing>
           <wp:inline distT="0" distB="0" distL="0" distR="0" wp14:anchorId="5CCF6BD1" wp14:editId="2FD01676">
             <wp:extent cx="5400040" cy="3452495"/>
@@ -1528,8 +1717,6 @@
           </wp:inline>
         </w:drawing>
       </w:r>
-      <w:bookmarkStart w:id="0" w:name="_GoBack"/>
-      <w:bookmarkEnd w:id="0"/>
     </w:p>
     <w:p>
       <w:pPr>
@@ -2297,6 +2484,7 @@
           <w:b/>
           <w:lang w:eastAsia="pt-BR"/>
         </w:rPr>
+        <w:lastRenderedPageBreak/>
         <w:t>3.</w:t>
       </w:r>
       <w:r>
@@ -14196,7 +14384,6 @@
     <w:name w:val="Normal (Web)"/>
     <w:basedOn w:val="Normal"/>
     <w:uiPriority w:val="99"/>
-    <w:semiHidden/>
     <w:unhideWhenUsed/>
     <w:rsid w:val="00665096"/>
     <w:pPr>
@@ -14303,6 +14490,17 @@
     <w:name w:val="eop"/>
     <w:basedOn w:val="Fontepargpadro"/>
     <w:rsid w:val="0006384A"/>
+  </w:style>
+  <w:style w:type="character" w:styleId="nfase">
+    <w:name w:val="Emphasis"/>
+    <w:basedOn w:val="Fontepargpadro"/>
+    <w:uiPriority w:val="20"/>
+    <w:qFormat/>
+    <w:rsid w:val="00797852"/>
+    <w:rPr>
+      <w:i/>
+      <w:iCs/>
+    </w:rPr>
   </w:style>
 </w:styles>
 </file>

</xml_diff>

<commit_message>
Realização da dashboard. Ajustes na home e formulário. Inserção do header e footer na página de formulário e na página da dashboard
</commit_message>
<xml_diff>
--- a/artefatos/Documentacao.docx
+++ b/artefatos/Documentacao.docx
@@ -356,8 +356,6 @@
       <w:r>
         <w:t xml:space="preserve"> foi sendo aprimorada através de apresentações e interações com diferentes públicos. Todos esses valores compõem a essência do meu desafio individual.</w:t>
       </w:r>
-      <w:bookmarkStart w:id="0" w:name="_GoBack"/>
-      <w:bookmarkEnd w:id="0"/>
     </w:p>
     <w:p>
       <w:pPr>
@@ -4823,6 +4821,15 @@
         </w:rPr>
         <w:t xml:space="preserve">Classe atual </w:t>
       </w:r>
+      <w:r>
+        <w:rPr>
+          <w:rFonts w:ascii="Times New Roman" w:eastAsia="Times New Roman" w:hAnsi="Times New Roman" w:cs="Times New Roman"/>
+          <w:sz w:val="24"/>
+          <w:szCs w:val="24"/>
+          <w:lang w:eastAsia="pt-BR"/>
+        </w:rPr>
+        <w:t>– combo box</w:t>
+      </w:r>
     </w:p>
     <w:p>
       <w:pPr>
@@ -6194,6 +6201,8 @@
         </w:rPr>
         <w:t>– quantas vezes por mês?</w:t>
       </w:r>
+      <w:bookmarkStart w:id="0" w:name="_GoBack"/>
+      <w:bookmarkEnd w:id="0"/>
     </w:p>
     <w:p>
       <w:pPr>
@@ -6394,6 +6403,15 @@
         </w:rPr>
         <w:t xml:space="preserve">categoria </w:t>
       </w:r>
+      <w:r>
+        <w:rPr>
+          <w:rFonts w:ascii="Times New Roman" w:eastAsia="Times New Roman" w:hAnsi="Times New Roman" w:cs="Times New Roman"/>
+          <w:sz w:val="24"/>
+          <w:szCs w:val="24"/>
+          <w:lang w:eastAsia="pt-BR"/>
+        </w:rPr>
+        <w:t>– acho melhor não ter</w:t>
+      </w:r>
     </w:p>
     <w:p>
       <w:pPr>
@@ -6558,171 +6576,6 @@
     </w:p>
     <w:p>
       <w:pPr>
-        <w:spacing w:before="100" w:beforeAutospacing="1" w:after="100" w:afterAutospacing="1" w:line="240" w:lineRule="auto"/>
-        <w:outlineLvl w:val="1"/>
-        <w:rPr>
-          <w:rFonts w:ascii="Times New Roman" w:eastAsia="Times New Roman" w:hAnsi="Times New Roman" w:cs="Times New Roman"/>
-          <w:b/>
-          <w:bCs/>
-          <w:sz w:val="36"/>
-          <w:szCs w:val="36"/>
-          <w:lang w:eastAsia="pt-BR"/>
-        </w:rPr>
-      </w:pPr>
-      <w:r>
-        <w:rPr>
-          <w:rFonts w:ascii="Segoe UI Emoji" w:eastAsia="Times New Roman" w:hAnsi="Segoe UI Emoji" w:cs="Segoe UI Emoji"/>
-          <w:b/>
-          <w:bCs/>
-          <w:sz w:val="36"/>
-          <w:szCs w:val="36"/>
-          <w:lang w:eastAsia="pt-BR"/>
-        </w:rPr>
-        <w:t>🏆</w:t>
-      </w:r>
-      <w:r>
-        <w:rPr>
-          <w:rFonts w:ascii="Times New Roman" w:eastAsia="Times New Roman" w:hAnsi="Times New Roman" w:cs="Times New Roman"/>
-          <w:b/>
-          <w:bCs/>
-          <w:sz w:val="36"/>
-          <w:szCs w:val="36"/>
-          <w:lang w:eastAsia="pt-BR"/>
-        </w:rPr>
-        <w:t xml:space="preserve"> Participação em eventos</w:t>
-      </w:r>
-      <w:r>
-        <w:rPr>
-          <w:rFonts w:ascii="Times New Roman" w:eastAsia="Times New Roman" w:hAnsi="Times New Roman" w:cs="Times New Roman"/>
-          <w:b/>
-          <w:bCs/>
-          <w:sz w:val="36"/>
-          <w:szCs w:val="36"/>
-          <w:lang w:eastAsia="pt-BR"/>
-        </w:rPr>
-        <w:t xml:space="preserve"> – não tem necessidade</w:t>
-      </w:r>
-    </w:p>
-    <w:p>
-      <w:pPr>
-        <w:numPr>
-          <w:ilvl w:val="0"/>
-          <w:numId w:val="13"/>
-        </w:numPr>
-        <w:spacing w:before="100" w:beforeAutospacing="1" w:after="100" w:afterAutospacing="1" w:line="240" w:lineRule="auto"/>
-        <w:rPr>
-          <w:rFonts w:ascii="Times New Roman" w:eastAsia="Times New Roman" w:hAnsi="Times New Roman" w:cs="Times New Roman"/>
-          <w:sz w:val="24"/>
-          <w:szCs w:val="24"/>
-          <w:lang w:eastAsia="pt-BR"/>
-        </w:rPr>
-      </w:pPr>
-      <w:r>
-        <w:rPr>
-          <w:rFonts w:ascii="Times New Roman" w:eastAsia="Times New Roman" w:hAnsi="Times New Roman" w:cs="Times New Roman"/>
-          <w:sz w:val="24"/>
-          <w:szCs w:val="24"/>
-          <w:lang w:eastAsia="pt-BR"/>
-        </w:rPr>
-        <w:t xml:space="preserve">id </w:t>
-      </w:r>
-    </w:p>
-    <w:p>
-      <w:pPr>
-        <w:numPr>
-          <w:ilvl w:val="0"/>
-          <w:numId w:val="13"/>
-        </w:numPr>
-        <w:spacing w:before="100" w:beforeAutospacing="1" w:after="100" w:afterAutospacing="1" w:line="240" w:lineRule="auto"/>
-        <w:rPr>
-          <w:rFonts w:ascii="Times New Roman" w:eastAsia="Times New Roman" w:hAnsi="Times New Roman" w:cs="Times New Roman"/>
-          <w:sz w:val="24"/>
-          <w:szCs w:val="24"/>
-          <w:lang w:eastAsia="pt-BR"/>
-        </w:rPr>
-      </w:pPr>
-      <w:proofErr w:type="spellStart"/>
-      <w:r>
-        <w:rPr>
-          <w:rFonts w:ascii="Times New Roman" w:eastAsia="Times New Roman" w:hAnsi="Times New Roman" w:cs="Times New Roman"/>
-          <w:sz w:val="24"/>
-          <w:szCs w:val="24"/>
-          <w:lang w:eastAsia="pt-BR"/>
-        </w:rPr>
-        <w:t>fkUsuario</w:t>
-      </w:r>
-      <w:proofErr w:type="spellEnd"/>
-      <w:r>
-        <w:rPr>
-          <w:rFonts w:ascii="Times New Roman" w:eastAsia="Times New Roman" w:hAnsi="Times New Roman" w:cs="Times New Roman"/>
-          <w:sz w:val="24"/>
-          <w:szCs w:val="24"/>
-          <w:lang w:eastAsia="pt-BR"/>
-        </w:rPr>
-        <w:t xml:space="preserve"> </w:t>
-      </w:r>
-    </w:p>
-    <w:p>
-      <w:pPr>
-        <w:numPr>
-          <w:ilvl w:val="0"/>
-          <w:numId w:val="13"/>
-        </w:numPr>
-        <w:spacing w:before="100" w:beforeAutospacing="1" w:after="100" w:afterAutospacing="1" w:line="240" w:lineRule="auto"/>
-        <w:rPr>
-          <w:rFonts w:ascii="Times New Roman" w:eastAsia="Times New Roman" w:hAnsi="Times New Roman" w:cs="Times New Roman"/>
-          <w:sz w:val="24"/>
-          <w:szCs w:val="24"/>
-          <w:lang w:eastAsia="pt-BR"/>
-        </w:rPr>
-      </w:pPr>
-      <w:proofErr w:type="spellStart"/>
-      <w:r>
-        <w:rPr>
-          <w:rFonts w:ascii="Times New Roman" w:eastAsia="Times New Roman" w:hAnsi="Times New Roman" w:cs="Times New Roman"/>
-          <w:sz w:val="24"/>
-          <w:szCs w:val="24"/>
-          <w:lang w:eastAsia="pt-BR"/>
-        </w:rPr>
-        <w:t>fkEvento</w:t>
-      </w:r>
-      <w:proofErr w:type="spellEnd"/>
-      <w:r>
-        <w:rPr>
-          <w:rFonts w:ascii="Times New Roman" w:eastAsia="Times New Roman" w:hAnsi="Times New Roman" w:cs="Times New Roman"/>
-          <w:sz w:val="24"/>
-          <w:szCs w:val="24"/>
-          <w:lang w:eastAsia="pt-BR"/>
-        </w:rPr>
-        <w:t xml:space="preserve"> </w:t>
-      </w:r>
-    </w:p>
-    <w:p>
-      <w:pPr>
-        <w:numPr>
-          <w:ilvl w:val="0"/>
-          <w:numId w:val="13"/>
-        </w:numPr>
-        <w:spacing w:before="100" w:beforeAutospacing="1" w:after="100" w:afterAutospacing="1" w:line="240" w:lineRule="auto"/>
-        <w:rPr>
-          <w:rFonts w:ascii="Times New Roman" w:eastAsia="Times New Roman" w:hAnsi="Times New Roman" w:cs="Times New Roman"/>
-          <w:sz w:val="24"/>
-          <w:szCs w:val="24"/>
-          <w:lang w:eastAsia="pt-BR"/>
-        </w:rPr>
-      </w:pPr>
-      <w:r>
-        <w:rPr>
-          <w:rFonts w:ascii="Times New Roman" w:eastAsia="Times New Roman" w:hAnsi="Times New Roman" w:cs="Times New Roman"/>
-          <w:sz w:val="24"/>
-          <w:szCs w:val="24"/>
-          <w:lang w:eastAsia="pt-BR"/>
-        </w:rPr>
-        <w:t xml:space="preserve">presença </w:t>
-      </w:r>
-    </w:p>
-    <w:p>
-      <w:pPr>
         <w:spacing w:after="0" w:line="240" w:lineRule="auto"/>
         <w:rPr>
           <w:rFonts w:ascii="Times New Roman" w:eastAsia="Times New Roman" w:hAnsi="Times New Roman" w:cs="Times New Roman"/>
@@ -6738,7 +6591,6 @@
           <w:szCs w:val="24"/>
           <w:lang w:eastAsia="pt-BR"/>
         </w:rPr>
-        <w:lastRenderedPageBreak/>
         <w:pict>
           <v:rect id="_x0000_i1032" style="width:0;height:1.5pt" o:hralign="center" o:hrstd="t" o:hr="t" fillcolor="#a0a0a0" stroked="f"/>
         </w:pict>
@@ -6918,6 +6770,7 @@
           <w:szCs w:val="24"/>
           <w:lang w:eastAsia="pt-BR"/>
         </w:rPr>
+        <w:lastRenderedPageBreak/>
         <w:t xml:space="preserve">Laços: </w:t>
       </w:r>
     </w:p>

</xml_diff>

<commit_message>
Integração da dashboard com banco de dados pela API, criação da página de classesEspecialidades e ajustes na estilização das páginas
</commit_message>
<xml_diff>
--- a/artefatos/Documentacao.docx
+++ b/artefatos/Documentacao.docx
@@ -4348,6 +4348,8 @@
           <w:lang w:eastAsia="pt-BR"/>
         </w:rPr>
       </w:pPr>
+      <w:bookmarkStart w:id="0" w:name="_GoBack"/>
+      <w:bookmarkEnd w:id="0"/>
     </w:p>
     <w:p>
       <w:pPr>
@@ -4615,369 +4617,18 @@
     </w:p>
     <w:p>
       <w:pPr>
-        <w:spacing w:after="0" w:line="240" w:lineRule="auto"/>
-        <w:rPr>
-          <w:rFonts w:ascii="Times New Roman" w:eastAsia="Times New Roman" w:hAnsi="Times New Roman" w:cs="Times New Roman"/>
-          <w:sz w:val="24"/>
-          <w:szCs w:val="24"/>
-          <w:lang w:eastAsia="pt-BR"/>
-        </w:rPr>
-      </w:pPr>
-    </w:p>
-    <w:p>
-      <w:pPr>
-        <w:spacing w:after="0" w:line="240" w:lineRule="auto"/>
-        <w:rPr>
-          <w:rFonts w:ascii="Times New Roman" w:eastAsia="Times New Roman" w:hAnsi="Times New Roman" w:cs="Times New Roman"/>
-          <w:sz w:val="24"/>
-          <w:szCs w:val="24"/>
-          <w:lang w:eastAsia="pt-BR"/>
-        </w:rPr>
-      </w:pPr>
-    </w:p>
-    <w:p>
-      <w:pPr>
-        <w:spacing w:after="0" w:line="240" w:lineRule="auto"/>
-        <w:rPr>
-          <w:rFonts w:ascii="Times New Roman" w:eastAsia="Times New Roman" w:hAnsi="Times New Roman" w:cs="Times New Roman"/>
-          <w:sz w:val="24"/>
-          <w:szCs w:val="24"/>
-          <w:lang w:eastAsia="pt-BR"/>
-        </w:rPr>
-      </w:pPr>
-    </w:p>
-    <w:p>
-      <w:pPr>
         <w:spacing w:before="100" w:beforeAutospacing="1" w:after="100" w:afterAutospacing="1" w:line="240" w:lineRule="auto"/>
-        <w:outlineLvl w:val="1"/>
-        <w:rPr>
-          <w:rFonts w:ascii="Times New Roman" w:eastAsia="Times New Roman" w:hAnsi="Times New Roman" w:cs="Times New Roman"/>
-          <w:b/>
-          <w:bCs/>
-          <w:sz w:val="36"/>
-          <w:szCs w:val="36"/>
-          <w:lang w:eastAsia="pt-BR"/>
-        </w:rPr>
-      </w:pPr>
-      <w:r>
-        <w:rPr>
-          <w:rFonts w:ascii="Times New Roman" w:eastAsia="Times New Roman" w:hAnsi="Times New Roman" w:cs="Times New Roman"/>
-          <w:b/>
-          <w:bCs/>
-          <w:sz w:val="36"/>
-          <w:szCs w:val="36"/>
-          <w:lang w:eastAsia="pt-BR"/>
-        </w:rPr>
-        <w:t xml:space="preserve">2.  Formulário </w:t>
-      </w:r>
-      <w:r>
-        <w:rPr>
-          <w:rFonts w:ascii="Times New Roman" w:eastAsia="Times New Roman" w:hAnsi="Times New Roman" w:cs="Times New Roman"/>
-          <w:b/>
-          <w:bCs/>
-          <w:sz w:val="36"/>
-          <w:szCs w:val="36"/>
-          <w:lang w:eastAsia="pt-BR"/>
-        </w:rPr>
-        <w:t>(D</w:t>
-      </w:r>
-      <w:r>
-        <w:rPr>
-          <w:rFonts w:ascii="Times New Roman" w:eastAsia="Times New Roman" w:hAnsi="Times New Roman" w:cs="Times New Roman"/>
-          <w:b/>
-          <w:bCs/>
-          <w:sz w:val="36"/>
-          <w:szCs w:val="36"/>
-          <w:lang w:eastAsia="pt-BR"/>
-        </w:rPr>
-        <w:t>ashboard)</w:t>
-      </w:r>
-    </w:p>
-    <w:p>
-      <w:pPr>
-        <w:numPr>
-          <w:ilvl w:val="0"/>
-          <w:numId w:val="2"/>
-        </w:numPr>
+        <w:rPr>
+          <w:rFonts w:ascii="Times New Roman" w:eastAsia="Times New Roman" w:hAnsi="Times New Roman" w:cs="Times New Roman"/>
+          <w:sz w:val="24"/>
+          <w:szCs w:val="24"/>
+          <w:lang w:eastAsia="pt-BR"/>
+        </w:rPr>
+      </w:pPr>
+    </w:p>
+    <w:p>
+      <w:pPr>
         <w:spacing w:before="100" w:beforeAutospacing="1" w:after="100" w:afterAutospacing="1" w:line="240" w:lineRule="auto"/>
-        <w:rPr>
-          <w:rFonts w:ascii="Times New Roman" w:eastAsia="Times New Roman" w:hAnsi="Times New Roman" w:cs="Times New Roman"/>
-          <w:sz w:val="24"/>
-          <w:szCs w:val="24"/>
-          <w:lang w:eastAsia="pt-BR"/>
-        </w:rPr>
-      </w:pPr>
-      <w:r>
-        <w:rPr>
-          <w:rFonts w:ascii="Times New Roman" w:eastAsia="Times New Roman" w:hAnsi="Times New Roman" w:cs="Times New Roman"/>
-          <w:sz w:val="24"/>
-          <w:szCs w:val="24"/>
-          <w:lang w:eastAsia="pt-BR"/>
-        </w:rPr>
-        <w:t xml:space="preserve">Nome </w:t>
-      </w:r>
-    </w:p>
-    <w:p>
-      <w:pPr>
-        <w:numPr>
-          <w:ilvl w:val="0"/>
-          <w:numId w:val="2"/>
-        </w:numPr>
-        <w:spacing w:before="100" w:beforeAutospacing="1" w:after="100" w:afterAutospacing="1" w:line="240" w:lineRule="auto"/>
-        <w:rPr>
-          <w:rFonts w:ascii="Times New Roman" w:eastAsia="Times New Roman" w:hAnsi="Times New Roman" w:cs="Times New Roman"/>
-          <w:sz w:val="24"/>
-          <w:szCs w:val="24"/>
-          <w:lang w:eastAsia="pt-BR"/>
-        </w:rPr>
-      </w:pPr>
-      <w:r>
-        <w:rPr>
-          <w:rFonts w:ascii="Times New Roman" w:eastAsia="Times New Roman" w:hAnsi="Times New Roman" w:cs="Times New Roman"/>
-          <w:sz w:val="24"/>
-          <w:szCs w:val="24"/>
-          <w:lang w:eastAsia="pt-BR"/>
-        </w:rPr>
-        <w:t xml:space="preserve">Idade </w:t>
-      </w:r>
-    </w:p>
-    <w:p>
-      <w:pPr>
-        <w:numPr>
-          <w:ilvl w:val="0"/>
-          <w:numId w:val="2"/>
-        </w:numPr>
-        <w:spacing w:before="100" w:beforeAutospacing="1" w:after="100" w:afterAutospacing="1" w:line="240" w:lineRule="auto"/>
-        <w:rPr>
-          <w:rFonts w:ascii="Times New Roman" w:eastAsia="Times New Roman" w:hAnsi="Times New Roman" w:cs="Times New Roman"/>
-          <w:sz w:val="24"/>
-          <w:szCs w:val="24"/>
-          <w:lang w:eastAsia="pt-BR"/>
-        </w:rPr>
-      </w:pPr>
-      <w:r>
-        <w:rPr>
-          <w:rFonts w:ascii="Times New Roman" w:eastAsia="Times New Roman" w:hAnsi="Times New Roman" w:cs="Times New Roman"/>
-          <w:sz w:val="24"/>
-          <w:szCs w:val="24"/>
-          <w:lang w:eastAsia="pt-BR"/>
-        </w:rPr>
-        <w:t xml:space="preserve">Sexo </w:t>
-      </w:r>
-      <w:r>
-        <w:rPr>
-          <w:rFonts w:ascii="Times New Roman" w:eastAsia="Times New Roman" w:hAnsi="Times New Roman" w:cs="Times New Roman"/>
-          <w:sz w:val="24"/>
-          <w:szCs w:val="24"/>
-          <w:lang w:eastAsia="pt-BR"/>
-        </w:rPr>
-        <w:t>– combo box</w:t>
-      </w:r>
-    </w:p>
-    <w:p>
-      <w:pPr>
-        <w:numPr>
-          <w:ilvl w:val="0"/>
-          <w:numId w:val="2"/>
-        </w:numPr>
-        <w:spacing w:before="100" w:beforeAutospacing="1" w:after="100" w:afterAutospacing="1" w:line="240" w:lineRule="auto"/>
-        <w:rPr>
-          <w:rFonts w:ascii="Times New Roman" w:eastAsia="Times New Roman" w:hAnsi="Times New Roman" w:cs="Times New Roman"/>
-          <w:sz w:val="24"/>
-          <w:szCs w:val="24"/>
-          <w:lang w:eastAsia="pt-BR"/>
-        </w:rPr>
-      </w:pPr>
-      <w:r>
-        <w:rPr>
-          <w:rFonts w:ascii="Times New Roman" w:eastAsia="Times New Roman" w:hAnsi="Times New Roman" w:cs="Times New Roman"/>
-          <w:sz w:val="24"/>
-          <w:szCs w:val="24"/>
-          <w:lang w:eastAsia="pt-BR"/>
-        </w:rPr>
-        <w:t xml:space="preserve">Tempo no clube </w:t>
-      </w:r>
-    </w:p>
-    <w:p>
-      <w:pPr>
-        <w:numPr>
-          <w:ilvl w:val="0"/>
-          <w:numId w:val="2"/>
-        </w:numPr>
-        <w:spacing w:before="100" w:beforeAutospacing="1" w:after="100" w:afterAutospacing="1" w:line="240" w:lineRule="auto"/>
-        <w:rPr>
-          <w:rFonts w:ascii="Times New Roman" w:eastAsia="Times New Roman" w:hAnsi="Times New Roman" w:cs="Times New Roman"/>
-          <w:sz w:val="24"/>
-          <w:szCs w:val="24"/>
-          <w:lang w:eastAsia="pt-BR"/>
-        </w:rPr>
-      </w:pPr>
-      <w:r>
-        <w:rPr>
-          <w:rFonts w:ascii="Times New Roman" w:eastAsia="Times New Roman" w:hAnsi="Times New Roman" w:cs="Times New Roman"/>
-          <w:sz w:val="24"/>
-          <w:szCs w:val="24"/>
-          <w:lang w:eastAsia="pt-BR"/>
-        </w:rPr>
-        <w:t xml:space="preserve">Classe atual </w:t>
-      </w:r>
-      <w:r>
-        <w:rPr>
-          <w:rFonts w:ascii="Times New Roman" w:eastAsia="Times New Roman" w:hAnsi="Times New Roman" w:cs="Times New Roman"/>
-          <w:sz w:val="24"/>
-          <w:szCs w:val="24"/>
-          <w:lang w:eastAsia="pt-BR"/>
-        </w:rPr>
-        <w:t>– combo box</w:t>
-      </w:r>
-    </w:p>
-    <w:p>
-      <w:pPr>
-        <w:numPr>
-          <w:ilvl w:val="0"/>
-          <w:numId w:val="2"/>
-        </w:numPr>
-        <w:spacing w:before="100" w:beforeAutospacing="1" w:after="100" w:afterAutospacing="1" w:line="240" w:lineRule="auto"/>
-        <w:rPr>
-          <w:rFonts w:ascii="Times New Roman" w:eastAsia="Times New Roman" w:hAnsi="Times New Roman" w:cs="Times New Roman"/>
-          <w:sz w:val="24"/>
-          <w:szCs w:val="24"/>
-          <w:lang w:eastAsia="pt-BR"/>
-        </w:rPr>
-      </w:pPr>
-      <w:r>
-        <w:rPr>
-          <w:rFonts w:ascii="Times New Roman" w:eastAsia="Times New Roman" w:hAnsi="Times New Roman" w:cs="Times New Roman"/>
-          <w:sz w:val="24"/>
-          <w:szCs w:val="24"/>
-          <w:lang w:eastAsia="pt-BR"/>
-        </w:rPr>
-        <w:t xml:space="preserve">Especialidade favorita </w:t>
-      </w:r>
-    </w:p>
-    <w:p>
-      <w:pPr>
-        <w:numPr>
-          <w:ilvl w:val="0"/>
-          <w:numId w:val="2"/>
-        </w:numPr>
-        <w:spacing w:before="100" w:beforeAutospacing="1" w:after="100" w:afterAutospacing="1" w:line="240" w:lineRule="auto"/>
-        <w:rPr>
-          <w:rFonts w:ascii="Times New Roman" w:eastAsia="Times New Roman" w:hAnsi="Times New Roman" w:cs="Times New Roman"/>
-          <w:sz w:val="24"/>
-          <w:szCs w:val="24"/>
-          <w:lang w:eastAsia="pt-BR"/>
-        </w:rPr>
-      </w:pPr>
-      <w:r>
-        <w:rPr>
-          <w:rFonts w:ascii="Times New Roman" w:eastAsia="Times New Roman" w:hAnsi="Times New Roman" w:cs="Times New Roman"/>
-          <w:sz w:val="24"/>
-          <w:szCs w:val="24"/>
-          <w:lang w:eastAsia="pt-BR"/>
-        </w:rPr>
-        <w:t xml:space="preserve">Quantidade de especialidades que já fez </w:t>
-      </w:r>
-    </w:p>
-    <w:p>
-      <w:pPr>
-        <w:numPr>
-          <w:ilvl w:val="0"/>
-          <w:numId w:val="2"/>
-        </w:numPr>
-        <w:spacing w:before="100" w:beforeAutospacing="1" w:after="100" w:afterAutospacing="1" w:line="240" w:lineRule="auto"/>
-        <w:rPr>
-          <w:rFonts w:ascii="Times New Roman" w:eastAsia="Times New Roman" w:hAnsi="Times New Roman" w:cs="Times New Roman"/>
-          <w:sz w:val="24"/>
-          <w:szCs w:val="24"/>
-          <w:lang w:eastAsia="pt-BR"/>
-        </w:rPr>
-      </w:pPr>
-      <w:r>
-        <w:rPr>
-          <w:rFonts w:ascii="Times New Roman" w:eastAsia="Times New Roman" w:hAnsi="Times New Roman" w:cs="Times New Roman"/>
-          <w:sz w:val="24"/>
-          <w:szCs w:val="24"/>
-          <w:lang w:eastAsia="pt-BR"/>
-        </w:rPr>
-        <w:t xml:space="preserve">Frequência (quantas vezes vai por mês) </w:t>
-      </w:r>
-    </w:p>
-    <w:p>
-      <w:pPr>
-        <w:numPr>
-          <w:ilvl w:val="0"/>
-          <w:numId w:val="2"/>
-        </w:numPr>
-        <w:spacing w:before="100" w:beforeAutospacing="1" w:after="100" w:afterAutospacing="1" w:line="240" w:lineRule="auto"/>
-        <w:rPr>
-          <w:rFonts w:ascii="Times New Roman" w:eastAsia="Times New Roman" w:hAnsi="Times New Roman" w:cs="Times New Roman"/>
-          <w:sz w:val="24"/>
-          <w:szCs w:val="24"/>
-          <w:lang w:eastAsia="pt-BR"/>
-        </w:rPr>
-      </w:pPr>
-      <w:r>
-        <w:rPr>
-          <w:rFonts w:ascii="Times New Roman" w:eastAsia="Times New Roman" w:hAnsi="Times New Roman" w:cs="Times New Roman"/>
-          <w:sz w:val="24"/>
-          <w:szCs w:val="24"/>
-          <w:lang w:eastAsia="pt-BR"/>
-        </w:rPr>
-        <w:t xml:space="preserve">Participa de acampamentos? (sim/não) </w:t>
-      </w:r>
-    </w:p>
-    <w:p>
-      <w:pPr>
-        <w:numPr>
-          <w:ilvl w:val="0"/>
-          <w:numId w:val="2"/>
-        </w:numPr>
-        <w:spacing w:before="100" w:beforeAutospacing="1" w:after="100" w:afterAutospacing="1" w:line="240" w:lineRule="auto"/>
-        <w:rPr>
-          <w:rFonts w:ascii="Times New Roman" w:eastAsia="Times New Roman" w:hAnsi="Times New Roman" w:cs="Times New Roman"/>
-          <w:sz w:val="24"/>
-          <w:szCs w:val="24"/>
-          <w:lang w:eastAsia="pt-BR"/>
-        </w:rPr>
-      </w:pPr>
-      <w:r>
-        <w:rPr>
-          <w:rFonts w:ascii="Times New Roman" w:eastAsia="Times New Roman" w:hAnsi="Times New Roman" w:cs="Times New Roman"/>
-          <w:sz w:val="24"/>
-          <w:szCs w:val="24"/>
-          <w:lang w:eastAsia="pt-BR"/>
-        </w:rPr>
-        <w:t xml:space="preserve">Interesse em liderança (sim/não) </w:t>
-      </w:r>
-    </w:p>
-    <w:p>
-      <w:pPr>
-        <w:spacing w:after="0" w:line="240" w:lineRule="auto"/>
-        <w:rPr>
-          <w:rFonts w:ascii="Times New Roman" w:eastAsia="Times New Roman" w:hAnsi="Times New Roman" w:cs="Times New Roman"/>
-          <w:sz w:val="24"/>
-          <w:szCs w:val="24"/>
-          <w:lang w:eastAsia="pt-BR"/>
-        </w:rPr>
-      </w:pPr>
-      <w:r>
-        <w:rPr>
-          <w:rFonts w:ascii="Times New Roman" w:eastAsia="Times New Roman" w:hAnsi="Times New Roman" w:cs="Times New Roman"/>
-          <w:sz w:val="24"/>
-          <w:szCs w:val="24"/>
-          <w:lang w:eastAsia="pt-BR"/>
-        </w:rPr>
-        <w:lastRenderedPageBreak/>
-        <w:pict>
-          <v:rect id="_x0000_i1025" style="width:0;height:1.5pt" o:hralign="center" o:hrstd="t" o:hr="t" fillcolor="#a0a0a0" stroked="f"/>
-        </w:pict>
-      </w:r>
-    </w:p>
-    <w:p>
-      <w:pPr>
-        <w:spacing w:before="100" w:beforeAutospacing="1" w:after="100" w:afterAutospacing="1" w:line="240" w:lineRule="auto"/>
-        <w:outlineLvl w:val="1"/>
         <w:rPr>
           <w:rFonts w:ascii="Segoe UI Emoji" w:eastAsia="Times New Roman" w:hAnsi="Segoe UI Emoji" w:cs="Segoe UI Emoji"/>
           <w:b/>
@@ -4988,7 +4639,10 @@
           <w:lang w:eastAsia="pt-BR"/>
         </w:rPr>
       </w:pPr>
-      <w:r>
+    </w:p>
+    <w:p>
+      <w:pPr>
+        <w:spacing w:before="100" w:beforeAutospacing="1" w:after="100" w:afterAutospacing="1" w:line="240" w:lineRule="auto"/>
         <w:rPr>
           <w:rFonts w:ascii="Segoe UI Emoji" w:eastAsia="Times New Roman" w:hAnsi="Segoe UI Emoji" w:cs="Segoe UI Emoji"/>
           <w:b/>
@@ -4998,655 +4652,11 @@
           <w:szCs w:val="48"/>
           <w:lang w:eastAsia="pt-BR"/>
         </w:rPr>
-        <w:t>Dashboard</w:t>
-      </w:r>
+      </w:pPr>
     </w:p>
     <w:p>
       <w:pPr>
         <w:spacing w:before="100" w:beforeAutospacing="1" w:after="100" w:afterAutospacing="1" w:line="240" w:lineRule="auto"/>
-        <w:outlineLvl w:val="1"/>
-        <w:rPr>
-          <w:rFonts w:ascii="Times New Roman" w:eastAsia="Times New Roman" w:hAnsi="Times New Roman" w:cs="Times New Roman"/>
-          <w:b/>
-          <w:bCs/>
-          <w:sz w:val="36"/>
-          <w:szCs w:val="36"/>
-          <w:lang w:eastAsia="pt-BR"/>
-        </w:rPr>
-      </w:pPr>
-      <w:proofErr w:type="gramStart"/>
-      <w:r>
-        <w:rPr>
-          <w:rFonts w:ascii="Segoe UI Emoji" w:eastAsia="Times New Roman" w:hAnsi="Segoe UI Emoji" w:cs="Segoe UI Emoji"/>
-          <w:b/>
-          <w:bCs/>
-          <w:sz w:val="36"/>
-          <w:szCs w:val="36"/>
-          <w:lang w:eastAsia="pt-BR"/>
-        </w:rPr>
-        <w:t>📈</w:t>
-      </w:r>
-      <w:r>
-        <w:rPr>
-          <w:rFonts w:ascii="Times New Roman" w:eastAsia="Times New Roman" w:hAnsi="Times New Roman" w:cs="Times New Roman"/>
-          <w:b/>
-          <w:bCs/>
-          <w:sz w:val="36"/>
-          <w:szCs w:val="36"/>
-          <w:lang w:eastAsia="pt-BR"/>
-        </w:rPr>
-        <w:t xml:space="preserve"> Indicadores</w:t>
-      </w:r>
-      <w:proofErr w:type="gramEnd"/>
-      <w:r>
-        <w:rPr>
-          <w:rFonts w:ascii="Times New Roman" w:eastAsia="Times New Roman" w:hAnsi="Times New Roman" w:cs="Times New Roman"/>
-          <w:b/>
-          <w:bCs/>
-          <w:sz w:val="36"/>
-          <w:szCs w:val="36"/>
-          <w:lang w:eastAsia="pt-BR"/>
-        </w:rPr>
-        <w:t xml:space="preserve"> (KPIs)</w:t>
-      </w:r>
-    </w:p>
-    <w:p>
-      <w:pPr>
-        <w:spacing w:before="100" w:beforeAutospacing="1" w:after="100" w:afterAutospacing="1" w:line="240" w:lineRule="auto"/>
-        <w:outlineLvl w:val="2"/>
-        <w:rPr>
-          <w:rFonts w:ascii="Times New Roman" w:eastAsia="Times New Roman" w:hAnsi="Times New Roman" w:cs="Times New Roman"/>
-          <w:b/>
-          <w:bCs/>
-          <w:sz w:val="27"/>
-          <w:szCs w:val="27"/>
-          <w:lang w:eastAsia="pt-BR"/>
-        </w:rPr>
-      </w:pPr>
-      <w:r>
-        <w:rPr>
-          <w:rFonts w:ascii="Segoe UI Emoji" w:eastAsia="Times New Roman" w:hAnsi="Segoe UI Emoji" w:cs="Segoe UI Emoji"/>
-          <w:b/>
-          <w:bCs/>
-          <w:sz w:val="27"/>
-          <w:szCs w:val="27"/>
-          <w:lang w:eastAsia="pt-BR"/>
-        </w:rPr>
-        <w:t>📌</w:t>
-      </w:r>
-      <w:r>
-        <w:rPr>
-          <w:rFonts w:ascii="Times New Roman" w:eastAsia="Times New Roman" w:hAnsi="Times New Roman" w:cs="Times New Roman"/>
-          <w:b/>
-          <w:bCs/>
-          <w:sz w:val="27"/>
-          <w:szCs w:val="27"/>
-          <w:lang w:eastAsia="pt-BR"/>
-        </w:rPr>
-        <w:t xml:space="preserve"> Perfil dos Desbravadores</w:t>
-      </w:r>
-    </w:p>
-    <w:p>
-      <w:pPr>
-        <w:numPr>
-          <w:ilvl w:val="0"/>
-          <w:numId w:val="3"/>
-        </w:numPr>
-        <w:spacing w:before="100" w:beforeAutospacing="1" w:after="100" w:afterAutospacing="1" w:line="240" w:lineRule="auto"/>
-        <w:rPr>
-          <w:rFonts w:ascii="Times New Roman" w:eastAsia="Times New Roman" w:hAnsi="Times New Roman" w:cs="Times New Roman"/>
-          <w:sz w:val="24"/>
-          <w:szCs w:val="24"/>
-          <w:lang w:eastAsia="pt-BR"/>
-        </w:rPr>
-      </w:pPr>
-      <w:r>
-        <w:rPr>
-          <w:rFonts w:ascii="Times New Roman" w:eastAsia="Times New Roman" w:hAnsi="Times New Roman" w:cs="Times New Roman"/>
-          <w:sz w:val="24"/>
-          <w:szCs w:val="24"/>
-          <w:lang w:eastAsia="pt-BR"/>
-        </w:rPr>
-        <w:t xml:space="preserve">Média de idade </w:t>
-      </w:r>
-    </w:p>
-    <w:p>
-      <w:pPr>
-        <w:numPr>
-          <w:ilvl w:val="0"/>
-          <w:numId w:val="3"/>
-        </w:numPr>
-        <w:spacing w:before="100" w:beforeAutospacing="1" w:after="100" w:afterAutospacing="1" w:line="240" w:lineRule="auto"/>
-        <w:rPr>
-          <w:rFonts w:ascii="Times New Roman" w:eastAsia="Times New Roman" w:hAnsi="Times New Roman" w:cs="Times New Roman"/>
-          <w:sz w:val="24"/>
-          <w:szCs w:val="24"/>
-          <w:lang w:eastAsia="pt-BR"/>
-        </w:rPr>
-      </w:pPr>
-      <w:r>
-        <w:rPr>
-          <w:rFonts w:ascii="Times New Roman" w:eastAsia="Times New Roman" w:hAnsi="Times New Roman" w:cs="Times New Roman"/>
-          <w:sz w:val="24"/>
-          <w:szCs w:val="24"/>
-          <w:lang w:eastAsia="pt-BR"/>
-        </w:rPr>
-        <w:t xml:space="preserve">Tempo médio no clube </w:t>
-      </w:r>
-    </w:p>
-    <w:p>
-      <w:pPr>
-        <w:numPr>
-          <w:ilvl w:val="0"/>
-          <w:numId w:val="3"/>
-        </w:numPr>
-        <w:spacing w:before="100" w:beforeAutospacing="1" w:after="100" w:afterAutospacing="1" w:line="240" w:lineRule="auto"/>
-        <w:rPr>
-          <w:rFonts w:ascii="Times New Roman" w:eastAsia="Times New Roman" w:hAnsi="Times New Roman" w:cs="Times New Roman"/>
-          <w:sz w:val="24"/>
-          <w:szCs w:val="24"/>
-          <w:lang w:eastAsia="pt-BR"/>
-        </w:rPr>
-      </w:pPr>
-      <w:r>
-        <w:rPr>
-          <w:rFonts w:ascii="Times New Roman" w:eastAsia="Times New Roman" w:hAnsi="Times New Roman" w:cs="Times New Roman"/>
-          <w:sz w:val="24"/>
-          <w:szCs w:val="24"/>
-          <w:lang w:eastAsia="pt-BR"/>
-        </w:rPr>
-        <w:t xml:space="preserve">% masculino x feminino </w:t>
-      </w:r>
-    </w:p>
-    <w:p>
-      <w:pPr>
-        <w:spacing w:before="100" w:beforeAutospacing="1" w:after="100" w:afterAutospacing="1" w:line="240" w:lineRule="auto"/>
-        <w:outlineLvl w:val="2"/>
-        <w:rPr>
-          <w:rFonts w:ascii="Times New Roman" w:eastAsia="Times New Roman" w:hAnsi="Times New Roman" w:cs="Times New Roman"/>
-          <w:b/>
-          <w:bCs/>
-          <w:sz w:val="27"/>
-          <w:szCs w:val="27"/>
-          <w:lang w:eastAsia="pt-BR"/>
-        </w:rPr>
-      </w:pPr>
-      <w:r>
-        <w:rPr>
-          <w:rFonts w:ascii="Segoe UI Emoji" w:eastAsia="Times New Roman" w:hAnsi="Segoe UI Emoji" w:cs="Segoe UI Emoji"/>
-          <w:b/>
-          <w:bCs/>
-          <w:sz w:val="27"/>
-          <w:szCs w:val="27"/>
-          <w:lang w:eastAsia="pt-BR"/>
-        </w:rPr>
-        <w:t>📌</w:t>
-      </w:r>
-      <w:r>
-        <w:rPr>
-          <w:rFonts w:ascii="Times New Roman" w:eastAsia="Times New Roman" w:hAnsi="Times New Roman" w:cs="Times New Roman"/>
-          <w:b/>
-          <w:bCs/>
-          <w:sz w:val="27"/>
-          <w:szCs w:val="27"/>
-          <w:lang w:eastAsia="pt-BR"/>
-        </w:rPr>
-        <w:t xml:space="preserve"> Engajamento</w:t>
-      </w:r>
-    </w:p>
-    <w:p>
-      <w:pPr>
-        <w:numPr>
-          <w:ilvl w:val="0"/>
-          <w:numId w:val="4"/>
-        </w:numPr>
-        <w:spacing w:before="100" w:beforeAutospacing="1" w:after="100" w:afterAutospacing="1" w:line="240" w:lineRule="auto"/>
-        <w:rPr>
-          <w:rFonts w:ascii="Times New Roman" w:eastAsia="Times New Roman" w:hAnsi="Times New Roman" w:cs="Times New Roman"/>
-          <w:sz w:val="24"/>
-          <w:szCs w:val="24"/>
-          <w:lang w:eastAsia="pt-BR"/>
-        </w:rPr>
-      </w:pPr>
-      <w:r>
-        <w:rPr>
-          <w:rFonts w:ascii="Times New Roman" w:eastAsia="Times New Roman" w:hAnsi="Times New Roman" w:cs="Times New Roman"/>
-          <w:sz w:val="24"/>
-          <w:szCs w:val="24"/>
-          <w:lang w:eastAsia="pt-BR"/>
-        </w:rPr>
-        <w:t xml:space="preserve">Média de frequência mensal </w:t>
-      </w:r>
-    </w:p>
-    <w:p>
-      <w:pPr>
-        <w:numPr>
-          <w:ilvl w:val="0"/>
-          <w:numId w:val="4"/>
-        </w:numPr>
-        <w:spacing w:before="100" w:beforeAutospacing="1" w:after="100" w:afterAutospacing="1" w:line="240" w:lineRule="auto"/>
-        <w:rPr>
-          <w:rFonts w:ascii="Times New Roman" w:eastAsia="Times New Roman" w:hAnsi="Times New Roman" w:cs="Times New Roman"/>
-          <w:sz w:val="24"/>
-          <w:szCs w:val="24"/>
-          <w:lang w:eastAsia="pt-BR"/>
-        </w:rPr>
-      </w:pPr>
-      <w:r>
-        <w:rPr>
-          <w:rFonts w:ascii="Times New Roman" w:eastAsia="Times New Roman" w:hAnsi="Times New Roman" w:cs="Times New Roman"/>
-          <w:sz w:val="24"/>
-          <w:szCs w:val="24"/>
-          <w:lang w:eastAsia="pt-BR"/>
-        </w:rPr>
-        <w:t xml:space="preserve">% que participam de acampamentos </w:t>
-      </w:r>
-    </w:p>
-    <w:p>
-      <w:pPr>
-        <w:numPr>
-          <w:ilvl w:val="0"/>
-          <w:numId w:val="4"/>
-        </w:numPr>
-        <w:spacing w:before="100" w:beforeAutospacing="1" w:after="100" w:afterAutospacing="1" w:line="240" w:lineRule="auto"/>
-        <w:rPr>
-          <w:rFonts w:ascii="Times New Roman" w:eastAsia="Times New Roman" w:hAnsi="Times New Roman" w:cs="Times New Roman"/>
-          <w:sz w:val="24"/>
-          <w:szCs w:val="24"/>
-          <w:lang w:eastAsia="pt-BR"/>
-        </w:rPr>
-      </w:pPr>
-      <w:r>
-        <w:rPr>
-          <w:rFonts w:ascii="Times New Roman" w:eastAsia="Times New Roman" w:hAnsi="Times New Roman" w:cs="Times New Roman"/>
-          <w:sz w:val="24"/>
-          <w:szCs w:val="24"/>
-          <w:lang w:eastAsia="pt-BR"/>
-        </w:rPr>
-        <w:t xml:space="preserve">% que querem ser líderes </w:t>
-      </w:r>
-    </w:p>
-    <w:p>
-      <w:pPr>
-        <w:spacing w:before="100" w:beforeAutospacing="1" w:after="100" w:afterAutospacing="1" w:line="240" w:lineRule="auto"/>
-        <w:outlineLvl w:val="2"/>
-        <w:rPr>
-          <w:rFonts w:ascii="Times New Roman" w:eastAsia="Times New Roman" w:hAnsi="Times New Roman" w:cs="Times New Roman"/>
-          <w:b/>
-          <w:bCs/>
-          <w:sz w:val="27"/>
-          <w:szCs w:val="27"/>
-          <w:lang w:eastAsia="pt-BR"/>
-        </w:rPr>
-      </w:pPr>
-      <w:r>
-        <w:rPr>
-          <w:rFonts w:ascii="Segoe UI Emoji" w:eastAsia="Times New Roman" w:hAnsi="Segoe UI Emoji" w:cs="Segoe UI Emoji"/>
-          <w:b/>
-          <w:bCs/>
-          <w:sz w:val="27"/>
-          <w:szCs w:val="27"/>
-          <w:lang w:eastAsia="pt-BR"/>
-        </w:rPr>
-        <w:t>📌</w:t>
-      </w:r>
-      <w:r>
-        <w:rPr>
-          <w:rFonts w:ascii="Times New Roman" w:eastAsia="Times New Roman" w:hAnsi="Times New Roman" w:cs="Times New Roman"/>
-          <w:b/>
-          <w:bCs/>
-          <w:sz w:val="27"/>
-          <w:szCs w:val="27"/>
-          <w:lang w:eastAsia="pt-BR"/>
-        </w:rPr>
-        <w:t xml:space="preserve"> Especialidades</w:t>
-      </w:r>
-    </w:p>
-    <w:p>
-      <w:pPr>
-        <w:numPr>
-          <w:ilvl w:val="0"/>
-          <w:numId w:val="5"/>
-        </w:numPr>
-        <w:spacing w:before="100" w:beforeAutospacing="1" w:after="100" w:afterAutospacing="1" w:line="240" w:lineRule="auto"/>
-        <w:rPr>
-          <w:rFonts w:ascii="Times New Roman" w:eastAsia="Times New Roman" w:hAnsi="Times New Roman" w:cs="Times New Roman"/>
-          <w:sz w:val="24"/>
-          <w:szCs w:val="24"/>
-          <w:lang w:eastAsia="pt-BR"/>
-        </w:rPr>
-      </w:pPr>
-      <w:r>
-        <w:rPr>
-          <w:rFonts w:ascii="Times New Roman" w:eastAsia="Times New Roman" w:hAnsi="Times New Roman" w:cs="Times New Roman"/>
-          <w:sz w:val="24"/>
-          <w:szCs w:val="24"/>
-          <w:lang w:eastAsia="pt-BR"/>
-        </w:rPr>
-        <w:t xml:space="preserve">Especialidade mais escolhida </w:t>
-      </w:r>
-    </w:p>
-    <w:p>
-      <w:pPr>
-        <w:numPr>
-          <w:ilvl w:val="0"/>
-          <w:numId w:val="5"/>
-        </w:numPr>
-        <w:spacing w:before="100" w:beforeAutospacing="1" w:after="100" w:afterAutospacing="1" w:line="240" w:lineRule="auto"/>
-        <w:rPr>
-          <w:rFonts w:ascii="Times New Roman" w:eastAsia="Times New Roman" w:hAnsi="Times New Roman" w:cs="Times New Roman"/>
-          <w:sz w:val="24"/>
-          <w:szCs w:val="24"/>
-          <w:lang w:eastAsia="pt-BR"/>
-        </w:rPr>
-      </w:pPr>
-      <w:r>
-        <w:rPr>
-          <w:rFonts w:ascii="Times New Roman" w:eastAsia="Times New Roman" w:hAnsi="Times New Roman" w:cs="Times New Roman"/>
-          <w:sz w:val="24"/>
-          <w:szCs w:val="24"/>
-          <w:lang w:eastAsia="pt-BR"/>
-        </w:rPr>
-        <w:t xml:space="preserve">Quantidade média por pessoa </w:t>
-      </w:r>
-    </w:p>
-    <w:p>
-      <w:pPr>
-        <w:numPr>
-          <w:ilvl w:val="0"/>
-          <w:numId w:val="5"/>
-        </w:numPr>
-        <w:spacing w:before="100" w:beforeAutospacing="1" w:after="100" w:afterAutospacing="1" w:line="240" w:lineRule="auto"/>
-        <w:rPr>
-          <w:rFonts w:ascii="Times New Roman" w:eastAsia="Times New Roman" w:hAnsi="Times New Roman" w:cs="Times New Roman"/>
-          <w:sz w:val="24"/>
-          <w:szCs w:val="24"/>
-          <w:lang w:eastAsia="pt-BR"/>
-        </w:rPr>
-      </w:pPr>
-      <w:r>
-        <w:rPr>
-          <w:rFonts w:ascii="Times New Roman" w:eastAsia="Times New Roman" w:hAnsi="Times New Roman" w:cs="Times New Roman"/>
-          <w:sz w:val="24"/>
-          <w:szCs w:val="24"/>
-          <w:lang w:eastAsia="pt-BR"/>
-        </w:rPr>
-        <w:t xml:space="preserve">Ranking das especialidades </w:t>
-      </w:r>
-    </w:p>
-    <w:p>
-      <w:pPr>
-        <w:spacing w:before="100" w:beforeAutospacing="1" w:after="100" w:afterAutospacing="1" w:line="240" w:lineRule="auto"/>
-        <w:outlineLvl w:val="2"/>
-        <w:rPr>
-          <w:rFonts w:ascii="Times New Roman" w:eastAsia="Times New Roman" w:hAnsi="Times New Roman" w:cs="Times New Roman"/>
-          <w:b/>
-          <w:bCs/>
-          <w:sz w:val="27"/>
-          <w:szCs w:val="27"/>
-          <w:lang w:eastAsia="pt-BR"/>
-        </w:rPr>
-      </w:pPr>
-      <w:r>
-        <w:rPr>
-          <w:rFonts w:ascii="Segoe UI Emoji" w:eastAsia="Times New Roman" w:hAnsi="Segoe UI Emoji" w:cs="Segoe UI Emoji"/>
-          <w:b/>
-          <w:bCs/>
-          <w:sz w:val="27"/>
-          <w:szCs w:val="27"/>
-          <w:lang w:eastAsia="pt-BR"/>
-        </w:rPr>
-        <w:t>📌</w:t>
-      </w:r>
-      <w:r>
-        <w:rPr>
-          <w:rFonts w:ascii="Times New Roman" w:eastAsia="Times New Roman" w:hAnsi="Times New Roman" w:cs="Times New Roman"/>
-          <w:b/>
-          <w:bCs/>
-          <w:sz w:val="27"/>
-          <w:szCs w:val="27"/>
-          <w:lang w:eastAsia="pt-BR"/>
-        </w:rPr>
-        <w:t xml:space="preserve"> Classes</w:t>
-      </w:r>
-    </w:p>
-    <w:p>
-      <w:pPr>
-        <w:numPr>
-          <w:ilvl w:val="0"/>
-          <w:numId w:val="6"/>
-        </w:numPr>
-        <w:spacing w:before="100" w:beforeAutospacing="1" w:after="100" w:afterAutospacing="1" w:line="240" w:lineRule="auto"/>
-        <w:rPr>
-          <w:rFonts w:ascii="Times New Roman" w:eastAsia="Times New Roman" w:hAnsi="Times New Roman" w:cs="Times New Roman"/>
-          <w:sz w:val="24"/>
-          <w:szCs w:val="24"/>
-          <w:lang w:eastAsia="pt-BR"/>
-        </w:rPr>
-      </w:pPr>
-      <w:r>
-        <w:rPr>
-          <w:rFonts w:ascii="Times New Roman" w:eastAsia="Times New Roman" w:hAnsi="Times New Roman" w:cs="Times New Roman"/>
-          <w:sz w:val="24"/>
-          <w:szCs w:val="24"/>
-          <w:lang w:eastAsia="pt-BR"/>
-        </w:rPr>
-        <w:t xml:space="preserve">Quantos estão em cada classe </w:t>
-      </w:r>
-    </w:p>
-    <w:p>
-      <w:pPr>
-        <w:numPr>
-          <w:ilvl w:val="0"/>
-          <w:numId w:val="6"/>
-        </w:numPr>
-        <w:spacing w:before="100" w:beforeAutospacing="1" w:after="100" w:afterAutospacing="1" w:line="240" w:lineRule="auto"/>
-        <w:rPr>
-          <w:rFonts w:ascii="Times New Roman" w:eastAsia="Times New Roman" w:hAnsi="Times New Roman" w:cs="Times New Roman"/>
-          <w:sz w:val="24"/>
-          <w:szCs w:val="24"/>
-          <w:lang w:eastAsia="pt-BR"/>
-        </w:rPr>
-      </w:pPr>
-      <w:r>
-        <w:rPr>
-          <w:rFonts w:ascii="Times New Roman" w:eastAsia="Times New Roman" w:hAnsi="Times New Roman" w:cs="Times New Roman"/>
-          <w:sz w:val="24"/>
-          <w:szCs w:val="24"/>
-          <w:lang w:eastAsia="pt-BR"/>
-        </w:rPr>
-        <w:t>Progressão (</w:t>
-      </w:r>
-      <w:proofErr w:type="spellStart"/>
-      <w:r>
-        <w:rPr>
-          <w:rFonts w:ascii="Times New Roman" w:eastAsia="Times New Roman" w:hAnsi="Times New Roman" w:cs="Times New Roman"/>
-          <w:sz w:val="24"/>
-          <w:szCs w:val="24"/>
-          <w:lang w:eastAsia="pt-BR"/>
-        </w:rPr>
-        <w:t>ex</w:t>
-      </w:r>
-      <w:proofErr w:type="spellEnd"/>
-      <w:r>
-        <w:rPr>
-          <w:rFonts w:ascii="Times New Roman" w:eastAsia="Times New Roman" w:hAnsi="Times New Roman" w:cs="Times New Roman"/>
-          <w:sz w:val="24"/>
-          <w:szCs w:val="24"/>
-          <w:lang w:eastAsia="pt-BR"/>
-        </w:rPr>
-        <w:t xml:space="preserve">: quantos estão perto de avançar) </w:t>
-      </w:r>
-    </w:p>
-    <w:p>
-      <w:pPr>
-        <w:spacing w:after="0" w:line="240" w:lineRule="auto"/>
-        <w:rPr>
-          <w:rFonts w:ascii="Times New Roman" w:eastAsia="Times New Roman" w:hAnsi="Times New Roman" w:cs="Times New Roman"/>
-          <w:sz w:val="24"/>
-          <w:szCs w:val="24"/>
-          <w:lang w:eastAsia="pt-BR"/>
-        </w:rPr>
-      </w:pPr>
-      <w:r>
-        <w:rPr>
-          <w:rFonts w:ascii="Times New Roman" w:eastAsia="Times New Roman" w:hAnsi="Times New Roman" w:cs="Times New Roman"/>
-          <w:sz w:val="24"/>
-          <w:szCs w:val="24"/>
-          <w:lang w:eastAsia="pt-BR"/>
-        </w:rPr>
-        <w:pict>
-          <v:rect id="_x0000_i1026" style="width:0;height:1.5pt" o:hralign="center" o:hrstd="t" o:hr="t" fillcolor="#a0a0a0" stroked="f"/>
-        </w:pict>
-      </w:r>
-    </w:p>
-    <w:p>
-      <w:pPr>
-        <w:spacing w:before="100" w:beforeAutospacing="1" w:after="100" w:afterAutospacing="1" w:line="240" w:lineRule="auto"/>
-        <w:outlineLvl w:val="1"/>
-        <w:rPr>
-          <w:rFonts w:ascii="Times New Roman" w:eastAsia="Times New Roman" w:hAnsi="Times New Roman" w:cs="Times New Roman"/>
-          <w:b/>
-          <w:bCs/>
-          <w:sz w:val="36"/>
-          <w:szCs w:val="36"/>
-          <w:lang w:eastAsia="pt-BR"/>
-        </w:rPr>
-      </w:pPr>
-      <w:r>
-        <w:rPr>
-          <w:rFonts w:ascii="Times New Roman" w:eastAsia="Times New Roman" w:hAnsi="Times New Roman" w:cs="Times New Roman"/>
-          <w:b/>
-          <w:bCs/>
-          <w:sz w:val="36"/>
-          <w:szCs w:val="36"/>
-          <w:lang w:eastAsia="pt-BR"/>
-        </w:rPr>
-        <w:t>Gráficos (Chart.js)</w:t>
-      </w:r>
-    </w:p>
-    <w:p>
-      <w:pPr>
-        <w:numPr>
-          <w:ilvl w:val="0"/>
-          <w:numId w:val="7"/>
-        </w:numPr>
-        <w:spacing w:before="100" w:beforeAutospacing="1" w:after="100" w:afterAutospacing="1" w:line="240" w:lineRule="auto"/>
-        <w:rPr>
-          <w:rFonts w:ascii="Times New Roman" w:eastAsia="Times New Roman" w:hAnsi="Times New Roman" w:cs="Times New Roman"/>
-          <w:sz w:val="24"/>
-          <w:szCs w:val="24"/>
-          <w:lang w:eastAsia="pt-BR"/>
-        </w:rPr>
-      </w:pPr>
-      <w:r>
-        <w:rPr>
-          <w:rFonts w:ascii="Times New Roman" w:eastAsia="Times New Roman" w:hAnsi="Times New Roman" w:cs="Times New Roman"/>
-          <w:sz w:val="24"/>
-          <w:szCs w:val="24"/>
-          <w:lang w:eastAsia="pt-BR"/>
-        </w:rPr>
-        <w:t xml:space="preserve">Pizza → sexo </w:t>
-      </w:r>
-    </w:p>
-    <w:p>
-      <w:pPr>
-        <w:numPr>
-          <w:ilvl w:val="0"/>
-          <w:numId w:val="7"/>
-        </w:numPr>
-        <w:spacing w:before="100" w:beforeAutospacing="1" w:after="100" w:afterAutospacing="1" w:line="240" w:lineRule="auto"/>
-        <w:rPr>
-          <w:rFonts w:ascii="Times New Roman" w:eastAsia="Times New Roman" w:hAnsi="Times New Roman" w:cs="Times New Roman"/>
-          <w:sz w:val="24"/>
-          <w:szCs w:val="24"/>
-          <w:lang w:eastAsia="pt-BR"/>
-        </w:rPr>
-      </w:pPr>
-      <w:r>
-        <w:rPr>
-          <w:rFonts w:ascii="Times New Roman" w:eastAsia="Times New Roman" w:hAnsi="Times New Roman" w:cs="Times New Roman"/>
-          <w:sz w:val="24"/>
-          <w:szCs w:val="24"/>
-          <w:lang w:eastAsia="pt-BR"/>
-        </w:rPr>
-        <w:t xml:space="preserve">Barras → especialidades mais populares </w:t>
-      </w:r>
-    </w:p>
-    <w:p>
-      <w:pPr>
-        <w:numPr>
-          <w:ilvl w:val="0"/>
-          <w:numId w:val="7"/>
-        </w:numPr>
-        <w:spacing w:before="100" w:beforeAutospacing="1" w:after="100" w:afterAutospacing="1" w:line="240" w:lineRule="auto"/>
-        <w:rPr>
-          <w:rFonts w:ascii="Times New Roman" w:eastAsia="Times New Roman" w:hAnsi="Times New Roman" w:cs="Times New Roman"/>
-          <w:sz w:val="24"/>
-          <w:szCs w:val="24"/>
-          <w:lang w:eastAsia="pt-BR"/>
-        </w:rPr>
-      </w:pPr>
-      <w:r>
-        <w:rPr>
-          <w:rFonts w:ascii="Times New Roman" w:eastAsia="Times New Roman" w:hAnsi="Times New Roman" w:cs="Times New Roman"/>
-          <w:sz w:val="24"/>
-          <w:szCs w:val="24"/>
-          <w:lang w:eastAsia="pt-BR"/>
-        </w:rPr>
-        <w:t xml:space="preserve">Linha → frequência </w:t>
-      </w:r>
-    </w:p>
-    <w:p>
-      <w:pPr>
-        <w:numPr>
-          <w:ilvl w:val="0"/>
-          <w:numId w:val="7"/>
-        </w:numPr>
-        <w:spacing w:before="100" w:beforeAutospacing="1" w:after="100" w:afterAutospacing="1" w:line="240" w:lineRule="auto"/>
-        <w:rPr>
-          <w:rFonts w:ascii="Times New Roman" w:eastAsia="Times New Roman" w:hAnsi="Times New Roman" w:cs="Times New Roman"/>
-          <w:sz w:val="24"/>
-          <w:szCs w:val="24"/>
-          <w:lang w:eastAsia="pt-BR"/>
-        </w:rPr>
-      </w:pPr>
-      <w:r>
-        <w:rPr>
-          <w:rFonts w:ascii="Times New Roman" w:eastAsia="Times New Roman" w:hAnsi="Times New Roman" w:cs="Times New Roman"/>
-          <w:sz w:val="24"/>
-          <w:szCs w:val="24"/>
-          <w:lang w:eastAsia="pt-BR"/>
-        </w:rPr>
-        <w:t xml:space="preserve">Barra → classes </w:t>
-      </w:r>
-    </w:p>
-    <w:p>
-      <w:pPr>
-        <w:spacing w:after="0" w:line="240" w:lineRule="auto"/>
-        <w:rPr>
-          <w:rFonts w:ascii="Times New Roman" w:eastAsia="Times New Roman" w:hAnsi="Times New Roman" w:cs="Times New Roman"/>
-          <w:sz w:val="24"/>
-          <w:szCs w:val="24"/>
-          <w:lang w:eastAsia="pt-BR"/>
-        </w:rPr>
-      </w:pPr>
-      <w:r>
-        <w:rPr>
-          <w:rFonts w:ascii="Times New Roman" w:eastAsia="Times New Roman" w:hAnsi="Times New Roman" w:cs="Times New Roman"/>
-          <w:sz w:val="24"/>
-          <w:szCs w:val="24"/>
-          <w:lang w:eastAsia="pt-BR"/>
-        </w:rPr>
-        <w:pict>
-          <v:rect id="_x0000_i1027" style="width:0;height:1.5pt" o:hralign="center" o:hrstd="t" o:hr="t" fillcolor="#a0a0a0" stroked="f"/>
-        </w:pict>
-      </w:r>
-    </w:p>
-    <w:p>
-      <w:pPr>
-        <w:spacing w:before="100" w:beforeAutospacing="1" w:after="100" w:afterAutospacing="1" w:line="240" w:lineRule="auto"/>
-        <w:outlineLvl w:val="0"/>
         <w:rPr>
           <w:rFonts w:ascii="Times New Roman" w:eastAsia="Times New Roman" w:hAnsi="Times New Roman" w:cs="Times New Roman"/>
           <w:sz w:val="24"/>
@@ -5664,948 +4674,9 @@
           <w:szCs w:val="48"/>
           <w:lang w:eastAsia="pt-BR"/>
         </w:rPr>
-        <w:t>Banco de dados</w:t>
-      </w:r>
-    </w:p>
-    <w:p>
-      <w:pPr>
-        <w:spacing w:before="100" w:beforeAutospacing="1" w:after="100" w:afterAutospacing="1" w:line="240" w:lineRule="auto"/>
-        <w:outlineLvl w:val="1"/>
-        <w:rPr>
-          <w:rFonts w:ascii="Times New Roman" w:eastAsia="Times New Roman" w:hAnsi="Times New Roman" w:cs="Times New Roman"/>
-          <w:b/>
-          <w:bCs/>
-          <w:sz w:val="36"/>
-          <w:szCs w:val="36"/>
-          <w:lang w:eastAsia="pt-BR"/>
-        </w:rPr>
-      </w:pPr>
-      <w:proofErr w:type="gramStart"/>
-      <w:r>
-        <w:rPr>
-          <w:rFonts w:ascii="Segoe UI Emoji" w:eastAsia="Times New Roman" w:hAnsi="Segoe UI Emoji" w:cs="Segoe UI Emoji"/>
-          <w:b/>
-          <w:bCs/>
-          <w:sz w:val="36"/>
-          <w:szCs w:val="36"/>
-          <w:lang w:eastAsia="pt-BR"/>
-        </w:rPr>
-        <w:t>🧑</w:t>
-      </w:r>
-      <w:r>
-        <w:rPr>
-          <w:rFonts w:ascii="Times New Roman" w:eastAsia="Times New Roman" w:hAnsi="Times New Roman" w:cs="Times New Roman"/>
-          <w:b/>
-          <w:bCs/>
-          <w:sz w:val="36"/>
-          <w:szCs w:val="36"/>
-          <w:lang w:eastAsia="pt-BR"/>
-        </w:rPr>
-        <w:t xml:space="preserve"> Usuário</w:t>
-      </w:r>
-      <w:proofErr w:type="gramEnd"/>
-    </w:p>
-    <w:p>
-      <w:pPr>
-        <w:numPr>
-          <w:ilvl w:val="0"/>
-          <w:numId w:val="8"/>
-        </w:numPr>
-        <w:spacing w:before="100" w:beforeAutospacing="1" w:after="100" w:afterAutospacing="1" w:line="240" w:lineRule="auto"/>
-        <w:rPr>
-          <w:rFonts w:ascii="Times New Roman" w:eastAsia="Times New Roman" w:hAnsi="Times New Roman" w:cs="Times New Roman"/>
-          <w:sz w:val="24"/>
-          <w:szCs w:val="24"/>
-          <w:lang w:eastAsia="pt-BR"/>
-        </w:rPr>
-      </w:pPr>
-      <w:r>
-        <w:rPr>
-          <w:rFonts w:ascii="Times New Roman" w:eastAsia="Times New Roman" w:hAnsi="Times New Roman" w:cs="Times New Roman"/>
-          <w:sz w:val="24"/>
-          <w:szCs w:val="24"/>
-          <w:lang w:eastAsia="pt-BR"/>
-        </w:rPr>
-        <w:lastRenderedPageBreak/>
-        <w:t xml:space="preserve">id </w:t>
-      </w:r>
-    </w:p>
-    <w:p>
-      <w:pPr>
-        <w:numPr>
-          <w:ilvl w:val="0"/>
-          <w:numId w:val="8"/>
-        </w:numPr>
-        <w:spacing w:before="100" w:beforeAutospacing="1" w:after="100" w:afterAutospacing="1" w:line="240" w:lineRule="auto"/>
-        <w:rPr>
-          <w:rFonts w:ascii="Times New Roman" w:eastAsia="Times New Roman" w:hAnsi="Times New Roman" w:cs="Times New Roman"/>
-          <w:sz w:val="24"/>
-          <w:szCs w:val="24"/>
-          <w:lang w:eastAsia="pt-BR"/>
-        </w:rPr>
-      </w:pPr>
-      <w:r>
-        <w:rPr>
-          <w:rFonts w:ascii="Times New Roman" w:eastAsia="Times New Roman" w:hAnsi="Times New Roman" w:cs="Times New Roman"/>
-          <w:sz w:val="24"/>
-          <w:szCs w:val="24"/>
-          <w:lang w:eastAsia="pt-BR"/>
-        </w:rPr>
-        <w:t xml:space="preserve">nome </w:t>
-      </w:r>
-    </w:p>
-    <w:p>
-      <w:pPr>
-        <w:numPr>
-          <w:ilvl w:val="0"/>
-          <w:numId w:val="8"/>
-        </w:numPr>
-        <w:spacing w:before="100" w:beforeAutospacing="1" w:after="100" w:afterAutospacing="1" w:line="240" w:lineRule="auto"/>
-        <w:rPr>
-          <w:rFonts w:ascii="Times New Roman" w:eastAsia="Times New Roman" w:hAnsi="Times New Roman" w:cs="Times New Roman"/>
-          <w:sz w:val="24"/>
-          <w:szCs w:val="24"/>
-          <w:lang w:eastAsia="pt-BR"/>
-        </w:rPr>
-      </w:pPr>
+        <w:t xml:space="preserve">Funções </w:t>
+      </w:r>
       <w:proofErr w:type="spellStart"/>
-      <w:r>
-        <w:rPr>
-          <w:rFonts w:ascii="Times New Roman" w:eastAsia="Times New Roman" w:hAnsi="Times New Roman" w:cs="Times New Roman"/>
-          <w:sz w:val="24"/>
-          <w:szCs w:val="24"/>
-          <w:lang w:eastAsia="pt-BR"/>
-        </w:rPr>
-        <w:t>email</w:t>
-      </w:r>
-      <w:proofErr w:type="spellEnd"/>
-      <w:r>
-        <w:rPr>
-          <w:rFonts w:ascii="Times New Roman" w:eastAsia="Times New Roman" w:hAnsi="Times New Roman" w:cs="Times New Roman"/>
-          <w:sz w:val="24"/>
-          <w:szCs w:val="24"/>
-          <w:lang w:eastAsia="pt-BR"/>
-        </w:rPr>
-        <w:t xml:space="preserve"> </w:t>
-      </w:r>
-    </w:p>
-    <w:p>
-      <w:pPr>
-        <w:numPr>
-          <w:ilvl w:val="0"/>
-          <w:numId w:val="8"/>
-        </w:numPr>
-        <w:spacing w:before="100" w:beforeAutospacing="1" w:after="100" w:afterAutospacing="1" w:line="240" w:lineRule="auto"/>
-        <w:rPr>
-          <w:rFonts w:ascii="Times New Roman" w:eastAsia="Times New Roman" w:hAnsi="Times New Roman" w:cs="Times New Roman"/>
-          <w:sz w:val="24"/>
-          <w:szCs w:val="24"/>
-          <w:lang w:eastAsia="pt-BR"/>
-        </w:rPr>
-      </w:pPr>
-      <w:r>
-        <w:rPr>
-          <w:rFonts w:ascii="Times New Roman" w:eastAsia="Times New Roman" w:hAnsi="Times New Roman" w:cs="Times New Roman"/>
-          <w:sz w:val="24"/>
-          <w:szCs w:val="24"/>
-          <w:lang w:eastAsia="pt-BR"/>
-        </w:rPr>
-        <w:t xml:space="preserve">senha </w:t>
-      </w:r>
-    </w:p>
-    <w:p>
-      <w:pPr>
-        <w:numPr>
-          <w:ilvl w:val="0"/>
-          <w:numId w:val="8"/>
-        </w:numPr>
-        <w:spacing w:before="100" w:beforeAutospacing="1" w:after="100" w:afterAutospacing="1" w:line="240" w:lineRule="auto"/>
-        <w:rPr>
-          <w:rFonts w:ascii="Times New Roman" w:eastAsia="Times New Roman" w:hAnsi="Times New Roman" w:cs="Times New Roman"/>
-          <w:sz w:val="24"/>
-          <w:szCs w:val="24"/>
-          <w:lang w:eastAsia="pt-BR"/>
-        </w:rPr>
-      </w:pPr>
-      <w:r>
-        <w:rPr>
-          <w:rFonts w:ascii="Times New Roman" w:eastAsia="Times New Roman" w:hAnsi="Times New Roman" w:cs="Times New Roman"/>
-          <w:sz w:val="24"/>
-          <w:szCs w:val="24"/>
-          <w:lang w:eastAsia="pt-BR"/>
-        </w:rPr>
-        <w:t xml:space="preserve">tipo (admin / desbravador) </w:t>
-      </w:r>
-    </w:p>
-    <w:p>
-      <w:pPr>
-        <w:spacing w:after="0" w:line="240" w:lineRule="auto"/>
-        <w:rPr>
-          <w:rFonts w:ascii="Times New Roman" w:eastAsia="Times New Roman" w:hAnsi="Times New Roman" w:cs="Times New Roman"/>
-          <w:sz w:val="24"/>
-          <w:szCs w:val="24"/>
-          <w:lang w:eastAsia="pt-BR"/>
-        </w:rPr>
-      </w:pPr>
-      <w:r>
-        <w:rPr>
-          <w:rFonts w:ascii="Times New Roman" w:eastAsia="Times New Roman" w:hAnsi="Times New Roman" w:cs="Times New Roman"/>
-          <w:sz w:val="24"/>
-          <w:szCs w:val="24"/>
-          <w:lang w:eastAsia="pt-BR"/>
-        </w:rPr>
-        <w:pict>
-          <v:rect id="_x0000_i1028" style="width:0;height:1.5pt" o:hralign="center" o:hrstd="t" o:hr="t" fillcolor="#a0a0a0" stroked="f"/>
-        </w:pict>
-      </w:r>
-    </w:p>
-    <w:p>
-      <w:pPr>
-        <w:spacing w:before="100" w:beforeAutospacing="1" w:after="100" w:afterAutospacing="1" w:line="240" w:lineRule="auto"/>
-        <w:outlineLvl w:val="1"/>
-        <w:rPr>
-          <w:rFonts w:ascii="Times New Roman" w:eastAsia="Times New Roman" w:hAnsi="Times New Roman" w:cs="Times New Roman"/>
-          <w:b/>
-          <w:bCs/>
-          <w:sz w:val="36"/>
-          <w:szCs w:val="36"/>
-          <w:lang w:eastAsia="pt-BR"/>
-        </w:rPr>
-      </w:pPr>
-      <w:r>
-        <w:rPr>
-          <w:rFonts w:ascii="Segoe UI Emoji" w:eastAsia="Times New Roman" w:hAnsi="Segoe UI Emoji" w:cs="Segoe UI Emoji"/>
-          <w:b/>
-          <w:bCs/>
-          <w:sz w:val="36"/>
-          <w:szCs w:val="36"/>
-          <w:lang w:eastAsia="pt-BR"/>
-        </w:rPr>
-        <w:t>📋</w:t>
-      </w:r>
-      <w:r>
-        <w:rPr>
-          <w:rFonts w:ascii="Times New Roman" w:eastAsia="Times New Roman" w:hAnsi="Times New Roman" w:cs="Times New Roman"/>
-          <w:b/>
-          <w:bCs/>
-          <w:sz w:val="36"/>
-          <w:szCs w:val="36"/>
-          <w:lang w:eastAsia="pt-BR"/>
-        </w:rPr>
-        <w:t xml:space="preserve"> Respostas (formulário)</w:t>
-      </w:r>
-    </w:p>
-    <w:p>
-      <w:pPr>
-        <w:numPr>
-          <w:ilvl w:val="0"/>
-          <w:numId w:val="9"/>
-        </w:numPr>
-        <w:spacing w:before="100" w:beforeAutospacing="1" w:after="100" w:afterAutospacing="1" w:line="240" w:lineRule="auto"/>
-        <w:rPr>
-          <w:rFonts w:ascii="Times New Roman" w:eastAsia="Times New Roman" w:hAnsi="Times New Roman" w:cs="Times New Roman"/>
-          <w:sz w:val="24"/>
-          <w:szCs w:val="24"/>
-          <w:lang w:eastAsia="pt-BR"/>
-        </w:rPr>
-      </w:pPr>
-      <w:r>
-        <w:rPr>
-          <w:rFonts w:ascii="Times New Roman" w:eastAsia="Times New Roman" w:hAnsi="Times New Roman" w:cs="Times New Roman"/>
-          <w:sz w:val="24"/>
-          <w:szCs w:val="24"/>
-          <w:lang w:eastAsia="pt-BR"/>
-        </w:rPr>
-        <w:t xml:space="preserve">id </w:t>
-      </w:r>
-    </w:p>
-    <w:p>
-      <w:pPr>
-        <w:numPr>
-          <w:ilvl w:val="0"/>
-          <w:numId w:val="9"/>
-        </w:numPr>
-        <w:spacing w:before="100" w:beforeAutospacing="1" w:after="100" w:afterAutospacing="1" w:line="240" w:lineRule="auto"/>
-        <w:rPr>
-          <w:rFonts w:ascii="Times New Roman" w:eastAsia="Times New Roman" w:hAnsi="Times New Roman" w:cs="Times New Roman"/>
-          <w:sz w:val="24"/>
-          <w:szCs w:val="24"/>
-          <w:lang w:eastAsia="pt-BR"/>
-        </w:rPr>
-      </w:pPr>
-      <w:proofErr w:type="spellStart"/>
-      <w:r>
-        <w:rPr>
-          <w:rFonts w:ascii="Times New Roman" w:eastAsia="Times New Roman" w:hAnsi="Times New Roman" w:cs="Times New Roman"/>
-          <w:sz w:val="24"/>
-          <w:szCs w:val="24"/>
-          <w:lang w:eastAsia="pt-BR"/>
-        </w:rPr>
-        <w:t>fkUsuario</w:t>
-      </w:r>
-      <w:proofErr w:type="spellEnd"/>
-      <w:r>
-        <w:rPr>
-          <w:rFonts w:ascii="Times New Roman" w:eastAsia="Times New Roman" w:hAnsi="Times New Roman" w:cs="Times New Roman"/>
-          <w:sz w:val="24"/>
-          <w:szCs w:val="24"/>
-          <w:lang w:eastAsia="pt-BR"/>
-        </w:rPr>
-        <w:t xml:space="preserve"> </w:t>
-      </w:r>
-    </w:p>
-    <w:p>
-      <w:pPr>
-        <w:numPr>
-          <w:ilvl w:val="0"/>
-          <w:numId w:val="9"/>
-        </w:numPr>
-        <w:spacing w:before="100" w:beforeAutospacing="1" w:after="100" w:afterAutospacing="1" w:line="240" w:lineRule="auto"/>
-        <w:rPr>
-          <w:rFonts w:ascii="Times New Roman" w:eastAsia="Times New Roman" w:hAnsi="Times New Roman" w:cs="Times New Roman"/>
-          <w:sz w:val="24"/>
-          <w:szCs w:val="24"/>
-          <w:lang w:eastAsia="pt-BR"/>
-        </w:rPr>
-      </w:pPr>
-      <w:r>
-        <w:rPr>
-          <w:rFonts w:ascii="Times New Roman" w:eastAsia="Times New Roman" w:hAnsi="Times New Roman" w:cs="Times New Roman"/>
-          <w:sz w:val="24"/>
-          <w:szCs w:val="24"/>
-          <w:lang w:eastAsia="pt-BR"/>
-        </w:rPr>
-        <w:t xml:space="preserve">idade </w:t>
-      </w:r>
-    </w:p>
-    <w:p>
-      <w:pPr>
-        <w:numPr>
-          <w:ilvl w:val="0"/>
-          <w:numId w:val="9"/>
-        </w:numPr>
-        <w:spacing w:before="100" w:beforeAutospacing="1" w:after="100" w:afterAutospacing="1" w:line="240" w:lineRule="auto"/>
-        <w:rPr>
-          <w:rFonts w:ascii="Times New Roman" w:eastAsia="Times New Roman" w:hAnsi="Times New Roman" w:cs="Times New Roman"/>
-          <w:sz w:val="24"/>
-          <w:szCs w:val="24"/>
-          <w:lang w:eastAsia="pt-BR"/>
-        </w:rPr>
-      </w:pPr>
-      <w:r>
-        <w:rPr>
-          <w:rFonts w:ascii="Times New Roman" w:eastAsia="Times New Roman" w:hAnsi="Times New Roman" w:cs="Times New Roman"/>
-          <w:sz w:val="24"/>
-          <w:szCs w:val="24"/>
-          <w:lang w:eastAsia="pt-BR"/>
-        </w:rPr>
-        <w:t xml:space="preserve">sexo </w:t>
-      </w:r>
-    </w:p>
-    <w:p>
-      <w:pPr>
-        <w:numPr>
-          <w:ilvl w:val="0"/>
-          <w:numId w:val="9"/>
-        </w:numPr>
-        <w:spacing w:before="100" w:beforeAutospacing="1" w:after="100" w:afterAutospacing="1" w:line="240" w:lineRule="auto"/>
-        <w:rPr>
-          <w:rFonts w:ascii="Times New Roman" w:eastAsia="Times New Roman" w:hAnsi="Times New Roman" w:cs="Times New Roman"/>
-          <w:sz w:val="24"/>
-          <w:szCs w:val="24"/>
-          <w:lang w:eastAsia="pt-BR"/>
-        </w:rPr>
-      </w:pPr>
-      <w:proofErr w:type="spellStart"/>
-      <w:r>
-        <w:rPr>
-          <w:rFonts w:ascii="Times New Roman" w:eastAsia="Times New Roman" w:hAnsi="Times New Roman" w:cs="Times New Roman"/>
-          <w:sz w:val="24"/>
-          <w:szCs w:val="24"/>
-          <w:lang w:eastAsia="pt-BR"/>
-        </w:rPr>
-        <w:t>tempoClube</w:t>
-      </w:r>
-      <w:proofErr w:type="spellEnd"/>
-      <w:r>
-        <w:rPr>
-          <w:rFonts w:ascii="Times New Roman" w:eastAsia="Times New Roman" w:hAnsi="Times New Roman" w:cs="Times New Roman"/>
-          <w:sz w:val="24"/>
-          <w:szCs w:val="24"/>
-          <w:lang w:eastAsia="pt-BR"/>
-        </w:rPr>
-        <w:t xml:space="preserve"> </w:t>
-      </w:r>
-      <w:r>
-        <w:rPr>
-          <w:rFonts w:ascii="Times New Roman" w:eastAsia="Times New Roman" w:hAnsi="Times New Roman" w:cs="Times New Roman"/>
-          <w:sz w:val="24"/>
-          <w:szCs w:val="24"/>
-          <w:lang w:eastAsia="pt-BR"/>
-        </w:rPr>
-        <w:t>– combo box com o numero</w:t>
-      </w:r>
-    </w:p>
-    <w:p>
-      <w:pPr>
-        <w:numPr>
-          <w:ilvl w:val="0"/>
-          <w:numId w:val="9"/>
-        </w:numPr>
-        <w:spacing w:before="100" w:beforeAutospacing="1" w:after="100" w:afterAutospacing="1" w:line="240" w:lineRule="auto"/>
-        <w:rPr>
-          <w:rFonts w:ascii="Times New Roman" w:eastAsia="Times New Roman" w:hAnsi="Times New Roman" w:cs="Times New Roman"/>
-          <w:sz w:val="24"/>
-          <w:szCs w:val="24"/>
-          <w:lang w:eastAsia="pt-BR"/>
-        </w:rPr>
-      </w:pPr>
-      <w:r>
-        <w:rPr>
-          <w:rFonts w:ascii="Times New Roman" w:eastAsia="Times New Roman" w:hAnsi="Times New Roman" w:cs="Times New Roman"/>
-          <w:sz w:val="24"/>
-          <w:szCs w:val="24"/>
-          <w:lang w:eastAsia="pt-BR"/>
-        </w:rPr>
-        <w:t xml:space="preserve">classe </w:t>
-      </w:r>
-      <w:r>
-        <w:rPr>
-          <w:rFonts w:ascii="Times New Roman" w:eastAsia="Times New Roman" w:hAnsi="Times New Roman" w:cs="Times New Roman"/>
-          <w:sz w:val="24"/>
-          <w:szCs w:val="24"/>
-          <w:lang w:eastAsia="pt-BR"/>
-        </w:rPr>
-        <w:t>– combo box com as classes especificas</w:t>
-      </w:r>
-    </w:p>
-    <w:p>
-      <w:pPr>
-        <w:numPr>
-          <w:ilvl w:val="0"/>
-          <w:numId w:val="9"/>
-        </w:numPr>
-        <w:spacing w:before="100" w:beforeAutospacing="1" w:after="100" w:afterAutospacing="1" w:line="240" w:lineRule="auto"/>
-        <w:rPr>
-          <w:rFonts w:ascii="Times New Roman" w:eastAsia="Times New Roman" w:hAnsi="Times New Roman" w:cs="Times New Roman"/>
-          <w:sz w:val="24"/>
-          <w:szCs w:val="24"/>
-          <w:lang w:eastAsia="pt-BR"/>
-        </w:rPr>
-      </w:pPr>
-      <w:proofErr w:type="spellStart"/>
-      <w:r>
-        <w:rPr>
-          <w:rFonts w:ascii="Times New Roman" w:eastAsia="Times New Roman" w:hAnsi="Times New Roman" w:cs="Times New Roman"/>
-          <w:sz w:val="24"/>
-          <w:szCs w:val="24"/>
-          <w:lang w:eastAsia="pt-BR"/>
-        </w:rPr>
-        <w:t>especialidadeFavorita</w:t>
-      </w:r>
-      <w:proofErr w:type="spellEnd"/>
-      <w:r>
-        <w:rPr>
-          <w:rFonts w:ascii="Times New Roman" w:eastAsia="Times New Roman" w:hAnsi="Times New Roman" w:cs="Times New Roman"/>
-          <w:sz w:val="24"/>
-          <w:szCs w:val="24"/>
-          <w:lang w:eastAsia="pt-BR"/>
-        </w:rPr>
-        <w:t xml:space="preserve"> </w:t>
-      </w:r>
-      <w:r>
-        <w:rPr>
-          <w:rFonts w:ascii="Times New Roman" w:eastAsia="Times New Roman" w:hAnsi="Times New Roman" w:cs="Times New Roman"/>
-          <w:sz w:val="24"/>
-          <w:szCs w:val="24"/>
-          <w:lang w:eastAsia="pt-BR"/>
-        </w:rPr>
-        <w:t>– combo box com especialidades especificas</w:t>
-      </w:r>
-    </w:p>
-    <w:p>
-      <w:pPr>
-        <w:numPr>
-          <w:ilvl w:val="0"/>
-          <w:numId w:val="9"/>
-        </w:numPr>
-        <w:spacing w:before="100" w:beforeAutospacing="1" w:after="100" w:afterAutospacing="1" w:line="240" w:lineRule="auto"/>
-        <w:rPr>
-          <w:rFonts w:ascii="Times New Roman" w:eastAsia="Times New Roman" w:hAnsi="Times New Roman" w:cs="Times New Roman"/>
-          <w:sz w:val="24"/>
-          <w:szCs w:val="24"/>
-          <w:lang w:eastAsia="pt-BR"/>
-        </w:rPr>
-      </w:pPr>
-      <w:proofErr w:type="spellStart"/>
-      <w:r>
-        <w:rPr>
-          <w:rFonts w:ascii="Times New Roman" w:eastAsia="Times New Roman" w:hAnsi="Times New Roman" w:cs="Times New Roman"/>
-          <w:sz w:val="24"/>
-          <w:szCs w:val="24"/>
-          <w:lang w:eastAsia="pt-BR"/>
-        </w:rPr>
-        <w:t>qtdEspecialidades</w:t>
-      </w:r>
-      <w:proofErr w:type="spellEnd"/>
-      <w:r>
-        <w:rPr>
-          <w:rFonts w:ascii="Times New Roman" w:eastAsia="Times New Roman" w:hAnsi="Times New Roman" w:cs="Times New Roman"/>
-          <w:sz w:val="24"/>
-          <w:szCs w:val="24"/>
-          <w:lang w:eastAsia="pt-BR"/>
-        </w:rPr>
-        <w:t xml:space="preserve"> </w:t>
-      </w:r>
-    </w:p>
-    <w:p>
-      <w:pPr>
-        <w:numPr>
-          <w:ilvl w:val="0"/>
-          <w:numId w:val="9"/>
-        </w:numPr>
-        <w:spacing w:before="100" w:beforeAutospacing="1" w:after="100" w:afterAutospacing="1" w:line="240" w:lineRule="auto"/>
-        <w:rPr>
-          <w:rFonts w:ascii="Times New Roman" w:eastAsia="Times New Roman" w:hAnsi="Times New Roman" w:cs="Times New Roman"/>
-          <w:sz w:val="24"/>
-          <w:szCs w:val="24"/>
-          <w:lang w:eastAsia="pt-BR"/>
-        </w:rPr>
-      </w:pPr>
-      <w:proofErr w:type="spellStart"/>
-      <w:r>
-        <w:rPr>
-          <w:rFonts w:ascii="Times New Roman" w:eastAsia="Times New Roman" w:hAnsi="Times New Roman" w:cs="Times New Roman"/>
-          <w:sz w:val="24"/>
-          <w:szCs w:val="24"/>
-          <w:lang w:eastAsia="pt-BR"/>
-        </w:rPr>
-        <w:t>frequencia</w:t>
-      </w:r>
-      <w:proofErr w:type="spellEnd"/>
-      <w:r>
-        <w:rPr>
-          <w:rFonts w:ascii="Times New Roman" w:eastAsia="Times New Roman" w:hAnsi="Times New Roman" w:cs="Times New Roman"/>
-          <w:sz w:val="24"/>
-          <w:szCs w:val="24"/>
-          <w:lang w:eastAsia="pt-BR"/>
-        </w:rPr>
-        <w:t xml:space="preserve"> </w:t>
-      </w:r>
-      <w:r>
-        <w:rPr>
-          <w:rFonts w:ascii="Times New Roman" w:eastAsia="Times New Roman" w:hAnsi="Times New Roman" w:cs="Times New Roman"/>
-          <w:sz w:val="24"/>
-          <w:szCs w:val="24"/>
-          <w:lang w:eastAsia="pt-BR"/>
-        </w:rPr>
-        <w:t>– quantas vezes por mês?</w:t>
-      </w:r>
-      <w:bookmarkStart w:id="0" w:name="_GoBack"/>
-      <w:bookmarkEnd w:id="0"/>
-    </w:p>
-    <w:p>
-      <w:pPr>
-        <w:numPr>
-          <w:ilvl w:val="0"/>
-          <w:numId w:val="9"/>
-        </w:numPr>
-        <w:spacing w:before="100" w:beforeAutospacing="1" w:after="100" w:afterAutospacing="1" w:line="240" w:lineRule="auto"/>
-        <w:rPr>
-          <w:rFonts w:ascii="Times New Roman" w:eastAsia="Times New Roman" w:hAnsi="Times New Roman" w:cs="Times New Roman"/>
-          <w:sz w:val="24"/>
-          <w:szCs w:val="24"/>
-          <w:lang w:eastAsia="pt-BR"/>
-        </w:rPr>
-      </w:pPr>
-      <w:proofErr w:type="spellStart"/>
-      <w:r>
-        <w:rPr>
-          <w:rFonts w:ascii="Times New Roman" w:eastAsia="Times New Roman" w:hAnsi="Times New Roman" w:cs="Times New Roman"/>
-          <w:sz w:val="24"/>
-          <w:szCs w:val="24"/>
-          <w:lang w:eastAsia="pt-BR"/>
-        </w:rPr>
-        <w:t>participaAcampamento</w:t>
-      </w:r>
-      <w:proofErr w:type="spellEnd"/>
-      <w:r>
-        <w:rPr>
-          <w:rFonts w:ascii="Times New Roman" w:eastAsia="Times New Roman" w:hAnsi="Times New Roman" w:cs="Times New Roman"/>
-          <w:sz w:val="24"/>
-          <w:szCs w:val="24"/>
-          <w:lang w:eastAsia="pt-BR"/>
-        </w:rPr>
-        <w:t xml:space="preserve"> </w:t>
-      </w:r>
-    </w:p>
-    <w:p>
-      <w:pPr>
-        <w:numPr>
-          <w:ilvl w:val="0"/>
-          <w:numId w:val="9"/>
-        </w:numPr>
-        <w:spacing w:before="100" w:beforeAutospacing="1" w:after="100" w:afterAutospacing="1" w:line="240" w:lineRule="auto"/>
-        <w:rPr>
-          <w:rFonts w:ascii="Times New Roman" w:eastAsia="Times New Roman" w:hAnsi="Times New Roman" w:cs="Times New Roman"/>
-          <w:sz w:val="24"/>
-          <w:szCs w:val="24"/>
-          <w:lang w:eastAsia="pt-BR"/>
-        </w:rPr>
-      </w:pPr>
-      <w:proofErr w:type="spellStart"/>
-      <w:r>
-        <w:rPr>
-          <w:rFonts w:ascii="Times New Roman" w:eastAsia="Times New Roman" w:hAnsi="Times New Roman" w:cs="Times New Roman"/>
-          <w:sz w:val="24"/>
-          <w:szCs w:val="24"/>
-          <w:lang w:eastAsia="pt-BR"/>
-        </w:rPr>
-        <w:t>interesseLideranca</w:t>
-      </w:r>
-      <w:proofErr w:type="spellEnd"/>
-      <w:r>
-        <w:rPr>
-          <w:rFonts w:ascii="Times New Roman" w:eastAsia="Times New Roman" w:hAnsi="Times New Roman" w:cs="Times New Roman"/>
-          <w:sz w:val="24"/>
-          <w:szCs w:val="24"/>
-          <w:lang w:eastAsia="pt-BR"/>
-        </w:rPr>
-        <w:t xml:space="preserve"> </w:t>
-      </w:r>
-    </w:p>
-    <w:p>
-      <w:pPr>
-        <w:spacing w:after="0" w:line="240" w:lineRule="auto"/>
-        <w:rPr>
-          <w:rFonts w:ascii="Times New Roman" w:eastAsia="Times New Roman" w:hAnsi="Times New Roman" w:cs="Times New Roman"/>
-          <w:sz w:val="24"/>
-          <w:szCs w:val="24"/>
-          <w:lang w:eastAsia="pt-BR"/>
-        </w:rPr>
-      </w:pPr>
-      <w:r>
-        <w:rPr>
-          <w:rFonts w:ascii="Times New Roman" w:eastAsia="Times New Roman" w:hAnsi="Times New Roman" w:cs="Times New Roman"/>
-          <w:sz w:val="24"/>
-          <w:szCs w:val="24"/>
-          <w:lang w:eastAsia="pt-BR"/>
-        </w:rPr>
-        <w:pict>
-          <v:rect id="_x0000_i1029" style="width:0;height:1.5pt" o:hralign="center" o:hrstd="t" o:hr="t" fillcolor="#a0a0a0" stroked="f"/>
-        </w:pict>
-      </w:r>
-    </w:p>
-    <w:p>
-      <w:pPr>
-        <w:spacing w:before="100" w:beforeAutospacing="1" w:after="100" w:afterAutospacing="1" w:line="240" w:lineRule="auto"/>
-        <w:outlineLvl w:val="1"/>
-        <w:rPr>
-          <w:rFonts w:ascii="Times New Roman" w:eastAsia="Times New Roman" w:hAnsi="Times New Roman" w:cs="Times New Roman"/>
-          <w:b/>
-          <w:bCs/>
-          <w:sz w:val="36"/>
-          <w:szCs w:val="36"/>
-          <w:lang w:eastAsia="pt-BR"/>
-        </w:rPr>
-      </w:pPr>
-      <w:r>
-        <w:rPr>
-          <w:rFonts w:ascii="Segoe UI Emoji" w:eastAsia="Times New Roman" w:hAnsi="Segoe UI Emoji" w:cs="Segoe UI Emoji"/>
-          <w:b/>
-          <w:bCs/>
-          <w:sz w:val="36"/>
-          <w:szCs w:val="36"/>
-          <w:lang w:eastAsia="pt-BR"/>
-        </w:rPr>
-        <w:t>📚</w:t>
-      </w:r>
-      <w:r>
-        <w:rPr>
-          <w:rFonts w:ascii="Times New Roman" w:eastAsia="Times New Roman" w:hAnsi="Times New Roman" w:cs="Times New Roman"/>
-          <w:b/>
-          <w:bCs/>
-          <w:sz w:val="36"/>
-          <w:szCs w:val="36"/>
-          <w:lang w:eastAsia="pt-BR"/>
-        </w:rPr>
-        <w:t xml:space="preserve"> Especialidades</w:t>
-      </w:r>
-    </w:p>
-    <w:p>
-      <w:pPr>
-        <w:numPr>
-          <w:ilvl w:val="0"/>
-          <w:numId w:val="10"/>
-        </w:numPr>
-        <w:spacing w:before="100" w:beforeAutospacing="1" w:after="100" w:afterAutospacing="1" w:line="240" w:lineRule="auto"/>
-        <w:rPr>
-          <w:rFonts w:ascii="Times New Roman" w:eastAsia="Times New Roman" w:hAnsi="Times New Roman" w:cs="Times New Roman"/>
-          <w:sz w:val="24"/>
-          <w:szCs w:val="24"/>
-          <w:lang w:eastAsia="pt-BR"/>
-        </w:rPr>
-      </w:pPr>
-      <w:r>
-        <w:rPr>
-          <w:rFonts w:ascii="Times New Roman" w:eastAsia="Times New Roman" w:hAnsi="Times New Roman" w:cs="Times New Roman"/>
-          <w:sz w:val="24"/>
-          <w:szCs w:val="24"/>
-          <w:lang w:eastAsia="pt-BR"/>
-        </w:rPr>
-        <w:t xml:space="preserve">id </w:t>
-      </w:r>
-    </w:p>
-    <w:p>
-      <w:pPr>
-        <w:numPr>
-          <w:ilvl w:val="0"/>
-          <w:numId w:val="10"/>
-        </w:numPr>
-        <w:spacing w:before="100" w:beforeAutospacing="1" w:after="100" w:afterAutospacing="1" w:line="240" w:lineRule="auto"/>
-        <w:rPr>
-          <w:rFonts w:ascii="Times New Roman" w:eastAsia="Times New Roman" w:hAnsi="Times New Roman" w:cs="Times New Roman"/>
-          <w:sz w:val="24"/>
-          <w:szCs w:val="24"/>
-          <w:lang w:eastAsia="pt-BR"/>
-        </w:rPr>
-      </w:pPr>
-      <w:r>
-        <w:rPr>
-          <w:rFonts w:ascii="Times New Roman" w:eastAsia="Times New Roman" w:hAnsi="Times New Roman" w:cs="Times New Roman"/>
-          <w:sz w:val="24"/>
-          <w:szCs w:val="24"/>
-          <w:lang w:eastAsia="pt-BR"/>
-        </w:rPr>
-        <w:t xml:space="preserve">nome </w:t>
-      </w:r>
-    </w:p>
-    <w:p>
-      <w:pPr>
-        <w:numPr>
-          <w:ilvl w:val="0"/>
-          <w:numId w:val="10"/>
-        </w:numPr>
-        <w:spacing w:before="100" w:beforeAutospacing="1" w:after="100" w:afterAutospacing="1" w:line="240" w:lineRule="auto"/>
-        <w:rPr>
-          <w:rFonts w:ascii="Times New Roman" w:eastAsia="Times New Roman" w:hAnsi="Times New Roman" w:cs="Times New Roman"/>
-          <w:sz w:val="24"/>
-          <w:szCs w:val="24"/>
-          <w:lang w:eastAsia="pt-BR"/>
-        </w:rPr>
-      </w:pPr>
-      <w:r>
-        <w:rPr>
-          <w:rFonts w:ascii="Times New Roman" w:eastAsia="Times New Roman" w:hAnsi="Times New Roman" w:cs="Times New Roman"/>
-          <w:sz w:val="24"/>
-          <w:szCs w:val="24"/>
-          <w:lang w:eastAsia="pt-BR"/>
-        </w:rPr>
-        <w:t xml:space="preserve">categoria </w:t>
-      </w:r>
-      <w:r>
-        <w:rPr>
-          <w:rFonts w:ascii="Times New Roman" w:eastAsia="Times New Roman" w:hAnsi="Times New Roman" w:cs="Times New Roman"/>
-          <w:sz w:val="24"/>
-          <w:szCs w:val="24"/>
-          <w:lang w:eastAsia="pt-BR"/>
-        </w:rPr>
-        <w:t>– acho melhor não ter</w:t>
-      </w:r>
-    </w:p>
-    <w:p>
-      <w:pPr>
-        <w:spacing w:after="0" w:line="240" w:lineRule="auto"/>
-        <w:rPr>
-          <w:rFonts w:ascii="Times New Roman" w:eastAsia="Times New Roman" w:hAnsi="Times New Roman" w:cs="Times New Roman"/>
-          <w:sz w:val="24"/>
-          <w:szCs w:val="24"/>
-          <w:lang w:eastAsia="pt-BR"/>
-        </w:rPr>
-      </w:pPr>
-      <w:r>
-        <w:rPr>
-          <w:rFonts w:ascii="Times New Roman" w:eastAsia="Times New Roman" w:hAnsi="Times New Roman" w:cs="Times New Roman"/>
-          <w:sz w:val="24"/>
-          <w:szCs w:val="24"/>
-          <w:lang w:eastAsia="pt-BR"/>
-        </w:rPr>
-        <w:pict>
-          <v:rect id="_x0000_i1030" style="width:0;height:1.5pt" o:hralign="center" o:hrstd="t" o:hr="t" fillcolor="#a0a0a0" stroked="f"/>
-        </w:pict>
-      </w:r>
-    </w:p>
-    <w:p>
-      <w:pPr>
-        <w:spacing w:before="100" w:beforeAutospacing="1" w:after="100" w:afterAutospacing="1" w:line="240" w:lineRule="auto"/>
-        <w:outlineLvl w:val="1"/>
-        <w:rPr>
-          <w:rFonts w:ascii="Times New Roman" w:eastAsia="Times New Roman" w:hAnsi="Times New Roman" w:cs="Times New Roman"/>
-          <w:b/>
-          <w:bCs/>
-          <w:sz w:val="36"/>
-          <w:szCs w:val="36"/>
-          <w:lang w:eastAsia="pt-BR"/>
-        </w:rPr>
-      </w:pPr>
-      <w:r>
-        <w:rPr>
-          <w:rFonts w:ascii="Segoe UI Emoji" w:eastAsia="Times New Roman" w:hAnsi="Segoe UI Emoji" w:cs="Segoe UI Emoji"/>
-          <w:b/>
-          <w:bCs/>
-          <w:sz w:val="36"/>
-          <w:szCs w:val="36"/>
-          <w:lang w:eastAsia="pt-BR"/>
-        </w:rPr>
-        <w:t>🎓</w:t>
-      </w:r>
-      <w:r>
-        <w:rPr>
-          <w:rFonts w:ascii="Times New Roman" w:eastAsia="Times New Roman" w:hAnsi="Times New Roman" w:cs="Times New Roman"/>
-          <w:b/>
-          <w:bCs/>
-          <w:sz w:val="36"/>
-          <w:szCs w:val="36"/>
-          <w:lang w:eastAsia="pt-BR"/>
-        </w:rPr>
-        <w:t xml:space="preserve"> Classes</w:t>
-      </w:r>
-    </w:p>
-    <w:p>
-      <w:pPr>
-        <w:numPr>
-          <w:ilvl w:val="0"/>
-          <w:numId w:val="11"/>
-        </w:numPr>
-        <w:spacing w:before="100" w:beforeAutospacing="1" w:after="100" w:afterAutospacing="1" w:line="240" w:lineRule="auto"/>
-        <w:rPr>
-          <w:rFonts w:ascii="Times New Roman" w:eastAsia="Times New Roman" w:hAnsi="Times New Roman" w:cs="Times New Roman"/>
-          <w:sz w:val="24"/>
-          <w:szCs w:val="24"/>
-          <w:lang w:eastAsia="pt-BR"/>
-        </w:rPr>
-      </w:pPr>
-      <w:r>
-        <w:rPr>
-          <w:rFonts w:ascii="Times New Roman" w:eastAsia="Times New Roman" w:hAnsi="Times New Roman" w:cs="Times New Roman"/>
-          <w:sz w:val="24"/>
-          <w:szCs w:val="24"/>
-          <w:lang w:eastAsia="pt-BR"/>
-        </w:rPr>
-        <w:t xml:space="preserve">id </w:t>
-      </w:r>
-    </w:p>
-    <w:p>
-      <w:pPr>
-        <w:numPr>
-          <w:ilvl w:val="0"/>
-          <w:numId w:val="11"/>
-        </w:numPr>
-        <w:spacing w:before="100" w:beforeAutospacing="1" w:after="100" w:afterAutospacing="1" w:line="240" w:lineRule="auto"/>
-        <w:rPr>
-          <w:rFonts w:ascii="Times New Roman" w:eastAsia="Times New Roman" w:hAnsi="Times New Roman" w:cs="Times New Roman"/>
-          <w:sz w:val="24"/>
-          <w:szCs w:val="24"/>
-          <w:lang w:eastAsia="pt-BR"/>
-        </w:rPr>
-      </w:pPr>
-      <w:r>
-        <w:rPr>
-          <w:rFonts w:ascii="Times New Roman" w:eastAsia="Times New Roman" w:hAnsi="Times New Roman" w:cs="Times New Roman"/>
-          <w:sz w:val="24"/>
-          <w:szCs w:val="24"/>
-          <w:lang w:eastAsia="pt-BR"/>
-        </w:rPr>
-        <w:t xml:space="preserve">nome </w:t>
-      </w:r>
-    </w:p>
-    <w:p>
-      <w:pPr>
-        <w:numPr>
-          <w:ilvl w:val="0"/>
-          <w:numId w:val="11"/>
-        </w:numPr>
-        <w:spacing w:before="100" w:beforeAutospacing="1" w:after="100" w:afterAutospacing="1" w:line="240" w:lineRule="auto"/>
-        <w:rPr>
-          <w:rFonts w:ascii="Times New Roman" w:eastAsia="Times New Roman" w:hAnsi="Times New Roman" w:cs="Times New Roman"/>
-          <w:sz w:val="24"/>
-          <w:szCs w:val="24"/>
-          <w:lang w:eastAsia="pt-BR"/>
-        </w:rPr>
-      </w:pPr>
-      <w:r>
-        <w:rPr>
-          <w:rFonts w:ascii="Times New Roman" w:eastAsia="Times New Roman" w:hAnsi="Times New Roman" w:cs="Times New Roman"/>
-          <w:sz w:val="24"/>
-          <w:szCs w:val="24"/>
-          <w:lang w:eastAsia="pt-BR"/>
-        </w:rPr>
-        <w:t xml:space="preserve">ordem </w:t>
-      </w:r>
-      <w:r>
-        <w:rPr>
-          <w:rFonts w:ascii="Times New Roman" w:eastAsia="Times New Roman" w:hAnsi="Times New Roman" w:cs="Times New Roman"/>
-          <w:sz w:val="24"/>
-          <w:szCs w:val="24"/>
-          <w:lang w:eastAsia="pt-BR"/>
-        </w:rPr>
-        <w:t>– NÃO ENTENDI</w:t>
-      </w:r>
-    </w:p>
-    <w:p>
-      <w:pPr>
-        <w:spacing w:after="0" w:line="240" w:lineRule="auto"/>
-        <w:rPr>
-          <w:rFonts w:ascii="Times New Roman" w:eastAsia="Times New Roman" w:hAnsi="Times New Roman" w:cs="Times New Roman"/>
-          <w:sz w:val="24"/>
-          <w:szCs w:val="24"/>
-          <w:lang w:eastAsia="pt-BR"/>
-        </w:rPr>
-      </w:pPr>
-      <w:r>
-        <w:rPr>
-          <w:rFonts w:ascii="Times New Roman" w:eastAsia="Times New Roman" w:hAnsi="Times New Roman" w:cs="Times New Roman"/>
-          <w:sz w:val="24"/>
-          <w:szCs w:val="24"/>
-          <w:lang w:eastAsia="pt-BR"/>
-        </w:rPr>
-        <w:pict>
-          <v:rect id="_x0000_i1031" style="width:0;height:1.5pt" o:hralign="center" o:hrstd="t" o:hr="t" fillcolor="#a0a0a0" stroked="f"/>
-        </w:pict>
-      </w:r>
-    </w:p>
-    <w:p>
-      <w:pPr>
-        <w:spacing w:after="0" w:line="240" w:lineRule="auto"/>
-        <w:rPr>
-          <w:rFonts w:ascii="Times New Roman" w:eastAsia="Times New Roman" w:hAnsi="Times New Roman" w:cs="Times New Roman"/>
-          <w:sz w:val="24"/>
-          <w:szCs w:val="24"/>
-          <w:lang w:eastAsia="pt-BR"/>
-        </w:rPr>
-      </w:pPr>
-      <w:r>
-        <w:rPr>
-          <w:rFonts w:ascii="Times New Roman" w:eastAsia="Times New Roman" w:hAnsi="Times New Roman" w:cs="Times New Roman"/>
-          <w:sz w:val="24"/>
-          <w:szCs w:val="24"/>
-          <w:lang w:eastAsia="pt-BR"/>
-        </w:rPr>
-        <w:pict>
-          <v:rect id="_x0000_i1032" style="width:0;height:1.5pt" o:hralign="center" o:hrstd="t" o:hr="t" fillcolor="#a0a0a0" stroked="f"/>
-        </w:pict>
-      </w:r>
-    </w:p>
-    <w:p>
-      <w:pPr>
-        <w:spacing w:before="100" w:beforeAutospacing="1" w:after="100" w:afterAutospacing="1" w:line="240" w:lineRule="auto"/>
-        <w:rPr>
-          <w:rFonts w:ascii="Times New Roman" w:eastAsia="Times New Roman" w:hAnsi="Times New Roman" w:cs="Times New Roman"/>
-          <w:sz w:val="24"/>
-          <w:szCs w:val="24"/>
-          <w:lang w:eastAsia="pt-BR"/>
-        </w:rPr>
-      </w:pPr>
       <w:r>
         <w:rPr>
           <w:rFonts w:ascii="Segoe UI Emoji" w:eastAsia="Times New Roman" w:hAnsi="Segoe UI Emoji" w:cs="Segoe UI Emoji"/>
@@ -6616,19 +4687,6 @@
           <w:szCs w:val="48"/>
           <w:lang w:eastAsia="pt-BR"/>
         </w:rPr>
-        <w:t xml:space="preserve">Funções </w:t>
-      </w:r>
-      <w:proofErr w:type="spellStart"/>
-      <w:r>
-        <w:rPr>
-          <w:rFonts w:ascii="Segoe UI Emoji" w:eastAsia="Times New Roman" w:hAnsi="Segoe UI Emoji" w:cs="Segoe UI Emoji"/>
-          <w:b/>
-          <w:bCs/>
-          <w:kern w:val="36"/>
-          <w:sz w:val="48"/>
-          <w:szCs w:val="48"/>
-          <w:lang w:eastAsia="pt-BR"/>
-        </w:rPr>
         <w:t>matematicas</w:t>
       </w:r>
       <w:proofErr w:type="spellEnd"/>
@@ -6770,7 +4828,6 @@
           <w:szCs w:val="24"/>
           <w:lang w:eastAsia="pt-BR"/>
         </w:rPr>
-        <w:lastRenderedPageBreak/>
         <w:t xml:space="preserve">Laços: </w:t>
       </w:r>
     </w:p>
@@ -6795,6 +4852,7 @@
           <w:szCs w:val="24"/>
           <w:lang w:eastAsia="pt-BR"/>
         </w:rPr>
+        <w:lastRenderedPageBreak/>
         <w:t xml:space="preserve">Percorrer respostas </w:t>
       </w:r>
     </w:p>

</xml_diff>

<commit_message>
Ajustes na estilização da navbar e do formulario e na modelagem de dados.
</commit_message>
<xml_diff>
--- a/artefatos/Documentacao.docx
+++ b/artefatos/Documentacao.docx
@@ -4348,8 +4348,6 @@
           <w:lang w:eastAsia="pt-BR"/>
         </w:rPr>
       </w:pPr>
-      <w:bookmarkStart w:id="0" w:name="_GoBack"/>
-      <w:bookmarkEnd w:id="0"/>
     </w:p>
     <w:p>
       <w:pPr>
@@ -4641,609 +4639,9 @@
       </w:pPr>
     </w:p>
     <w:p>
-      <w:pPr>
-        <w:spacing w:before="100" w:beforeAutospacing="1" w:after="100" w:afterAutospacing="1" w:line="240" w:lineRule="auto"/>
-        <w:rPr>
-          <w:rFonts w:ascii="Segoe UI Emoji" w:eastAsia="Times New Roman" w:hAnsi="Segoe UI Emoji" w:cs="Segoe UI Emoji"/>
-          <w:b/>
-          <w:bCs/>
-          <w:kern w:val="36"/>
-          <w:sz w:val="48"/>
-          <w:szCs w:val="48"/>
-          <w:lang w:eastAsia="pt-BR"/>
-        </w:rPr>
-      </w:pPr>
-    </w:p>
-    <w:p>
-      <w:pPr>
-        <w:spacing w:before="100" w:beforeAutospacing="1" w:after="100" w:afterAutospacing="1" w:line="240" w:lineRule="auto"/>
-        <w:rPr>
-          <w:rFonts w:ascii="Times New Roman" w:eastAsia="Times New Roman" w:hAnsi="Times New Roman" w:cs="Times New Roman"/>
-          <w:sz w:val="24"/>
-          <w:szCs w:val="24"/>
-          <w:lang w:eastAsia="pt-BR"/>
-        </w:rPr>
-      </w:pPr>
-      <w:r>
-        <w:rPr>
-          <w:rFonts w:ascii="Segoe UI Emoji" w:eastAsia="Times New Roman" w:hAnsi="Segoe UI Emoji" w:cs="Segoe UI Emoji"/>
-          <w:b/>
-          <w:bCs/>
-          <w:kern w:val="36"/>
-          <w:sz w:val="48"/>
-          <w:szCs w:val="48"/>
-          <w:lang w:eastAsia="pt-BR"/>
-        </w:rPr>
-        <w:t xml:space="preserve">Funções </w:t>
-      </w:r>
-      <w:proofErr w:type="spellStart"/>
-      <w:r>
-        <w:rPr>
-          <w:rFonts w:ascii="Segoe UI Emoji" w:eastAsia="Times New Roman" w:hAnsi="Segoe UI Emoji" w:cs="Segoe UI Emoji"/>
-          <w:b/>
-          <w:bCs/>
-          <w:kern w:val="36"/>
-          <w:sz w:val="48"/>
-          <w:szCs w:val="48"/>
-          <w:lang w:eastAsia="pt-BR"/>
-        </w:rPr>
-        <w:t>matematicas</w:t>
-      </w:r>
-      <w:proofErr w:type="spellEnd"/>
-    </w:p>
-    <w:p>
-      <w:pPr>
-        <w:numPr>
-          <w:ilvl w:val="0"/>
-          <w:numId w:val="14"/>
-        </w:numPr>
-        <w:spacing w:before="100" w:beforeAutospacing="1" w:after="100" w:afterAutospacing="1" w:line="240" w:lineRule="auto"/>
-        <w:rPr>
-          <w:rFonts w:ascii="Times New Roman" w:eastAsia="Times New Roman" w:hAnsi="Times New Roman" w:cs="Times New Roman"/>
-          <w:sz w:val="24"/>
-          <w:szCs w:val="24"/>
-          <w:lang w:eastAsia="pt-BR"/>
-        </w:rPr>
-      </w:pPr>
-      <w:r>
-        <w:rPr>
-          <w:rFonts w:ascii="Times New Roman" w:eastAsia="Times New Roman" w:hAnsi="Times New Roman" w:cs="Times New Roman"/>
-          <w:sz w:val="24"/>
-          <w:szCs w:val="24"/>
-          <w:lang w:eastAsia="pt-BR"/>
-        </w:rPr>
-        <w:t xml:space="preserve">Função para calcular média de idade </w:t>
-      </w:r>
-    </w:p>
-    <w:p>
-      <w:pPr>
-        <w:numPr>
-          <w:ilvl w:val="0"/>
-          <w:numId w:val="14"/>
-        </w:numPr>
-        <w:spacing w:before="100" w:beforeAutospacing="1" w:after="100" w:afterAutospacing="1" w:line="240" w:lineRule="auto"/>
-        <w:rPr>
-          <w:rFonts w:ascii="Times New Roman" w:eastAsia="Times New Roman" w:hAnsi="Times New Roman" w:cs="Times New Roman"/>
-          <w:sz w:val="24"/>
-          <w:szCs w:val="24"/>
-          <w:lang w:eastAsia="pt-BR"/>
-        </w:rPr>
-      </w:pPr>
-      <w:r>
-        <w:rPr>
-          <w:rFonts w:ascii="Times New Roman" w:eastAsia="Times New Roman" w:hAnsi="Times New Roman" w:cs="Times New Roman"/>
-          <w:sz w:val="24"/>
-          <w:szCs w:val="24"/>
-          <w:lang w:eastAsia="pt-BR"/>
-        </w:rPr>
-        <w:t xml:space="preserve">Função para calcular porcentagem </w:t>
-      </w:r>
-    </w:p>
-    <w:p>
-      <w:pPr>
-        <w:numPr>
-          <w:ilvl w:val="0"/>
-          <w:numId w:val="14"/>
-        </w:numPr>
-        <w:spacing w:before="100" w:beforeAutospacing="1" w:after="100" w:afterAutospacing="1" w:line="240" w:lineRule="auto"/>
-        <w:rPr>
-          <w:rFonts w:ascii="Times New Roman" w:eastAsia="Times New Roman" w:hAnsi="Times New Roman" w:cs="Times New Roman"/>
-          <w:sz w:val="24"/>
-          <w:szCs w:val="24"/>
-          <w:lang w:eastAsia="pt-BR"/>
-        </w:rPr>
-      </w:pPr>
-      <w:r>
-        <w:rPr>
-          <w:rFonts w:ascii="Times New Roman" w:eastAsia="Times New Roman" w:hAnsi="Times New Roman" w:cs="Times New Roman"/>
-          <w:sz w:val="24"/>
-          <w:szCs w:val="24"/>
-          <w:lang w:eastAsia="pt-BR"/>
-        </w:rPr>
-        <w:t>Condições (</w:t>
-      </w:r>
-      <w:proofErr w:type="spellStart"/>
-      <w:r>
-        <w:rPr>
-          <w:rFonts w:ascii="Times New Roman" w:eastAsia="Times New Roman" w:hAnsi="Times New Roman" w:cs="Times New Roman"/>
-          <w:sz w:val="24"/>
-          <w:szCs w:val="24"/>
-          <w:lang w:eastAsia="pt-BR"/>
-        </w:rPr>
-        <w:t>if</w:t>
-      </w:r>
-      <w:proofErr w:type="spellEnd"/>
-      <w:r>
-        <w:rPr>
-          <w:rFonts w:ascii="Times New Roman" w:eastAsia="Times New Roman" w:hAnsi="Times New Roman" w:cs="Times New Roman"/>
-          <w:sz w:val="24"/>
-          <w:szCs w:val="24"/>
-          <w:lang w:eastAsia="pt-BR"/>
-        </w:rPr>
-        <w:t xml:space="preserve">): </w:t>
-      </w:r>
-    </w:p>
-    <w:p>
-      <w:pPr>
-        <w:numPr>
-          <w:ilvl w:val="1"/>
-          <w:numId w:val="14"/>
-        </w:numPr>
-        <w:spacing w:before="100" w:beforeAutospacing="1" w:after="100" w:afterAutospacing="1" w:line="240" w:lineRule="auto"/>
-        <w:rPr>
-          <w:rFonts w:ascii="Times New Roman" w:eastAsia="Times New Roman" w:hAnsi="Times New Roman" w:cs="Times New Roman"/>
-          <w:sz w:val="24"/>
-          <w:szCs w:val="24"/>
-          <w:lang w:eastAsia="pt-BR"/>
-        </w:rPr>
-      </w:pPr>
-      <w:r>
-        <w:rPr>
-          <w:rFonts w:ascii="Times New Roman" w:eastAsia="Times New Roman" w:hAnsi="Times New Roman" w:cs="Times New Roman"/>
-          <w:sz w:val="24"/>
-          <w:szCs w:val="24"/>
-          <w:lang w:eastAsia="pt-BR"/>
-        </w:rPr>
-        <w:t xml:space="preserve">Se frequência &lt; X → pouco ativo </w:t>
-      </w:r>
-    </w:p>
-    <w:p>
-      <w:pPr>
-        <w:numPr>
-          <w:ilvl w:val="0"/>
-          <w:numId w:val="14"/>
-        </w:numPr>
-        <w:spacing w:before="100" w:beforeAutospacing="1" w:after="100" w:afterAutospacing="1" w:line="240" w:lineRule="auto"/>
-        <w:rPr>
-          <w:rFonts w:ascii="Times New Roman" w:eastAsia="Times New Roman" w:hAnsi="Times New Roman" w:cs="Times New Roman"/>
-          <w:sz w:val="24"/>
-          <w:szCs w:val="24"/>
-          <w:lang w:eastAsia="pt-BR"/>
-        </w:rPr>
-      </w:pPr>
-      <w:r>
-        <w:rPr>
-          <w:rFonts w:ascii="Times New Roman" w:eastAsia="Times New Roman" w:hAnsi="Times New Roman" w:cs="Times New Roman"/>
-          <w:sz w:val="24"/>
-          <w:szCs w:val="24"/>
-          <w:lang w:eastAsia="pt-BR"/>
-        </w:rPr>
-        <w:t xml:space="preserve">Laços: </w:t>
-      </w:r>
-    </w:p>
-    <w:p>
-      <w:pPr>
-        <w:numPr>
-          <w:ilvl w:val="1"/>
-          <w:numId w:val="14"/>
-        </w:numPr>
-        <w:spacing w:before="100" w:beforeAutospacing="1" w:after="100" w:afterAutospacing="1" w:line="240" w:lineRule="auto"/>
-        <w:rPr>
-          <w:rFonts w:ascii="Times New Roman" w:eastAsia="Times New Roman" w:hAnsi="Times New Roman" w:cs="Times New Roman"/>
-          <w:sz w:val="24"/>
-          <w:szCs w:val="24"/>
-          <w:lang w:eastAsia="pt-BR"/>
-        </w:rPr>
-      </w:pPr>
-      <w:r>
-        <w:rPr>
-          <w:rFonts w:ascii="Times New Roman" w:eastAsia="Times New Roman" w:hAnsi="Times New Roman" w:cs="Times New Roman"/>
-          <w:sz w:val="24"/>
-          <w:szCs w:val="24"/>
-          <w:lang w:eastAsia="pt-BR"/>
-        </w:rPr>
-        <w:lastRenderedPageBreak/>
-        <w:t xml:space="preserve">Percorrer respostas </w:t>
-      </w:r>
-    </w:p>
-    <w:p>
-      <w:pPr>
-        <w:numPr>
-          <w:ilvl w:val="0"/>
-          <w:numId w:val="14"/>
-        </w:numPr>
-        <w:spacing w:before="100" w:beforeAutospacing="1" w:after="100" w:afterAutospacing="1" w:line="240" w:lineRule="auto"/>
-        <w:rPr>
-          <w:rFonts w:ascii="Times New Roman" w:eastAsia="Times New Roman" w:hAnsi="Times New Roman" w:cs="Times New Roman"/>
-          <w:sz w:val="24"/>
-          <w:szCs w:val="24"/>
-          <w:lang w:eastAsia="pt-BR"/>
-        </w:rPr>
-      </w:pPr>
-      <w:r>
-        <w:rPr>
-          <w:rFonts w:ascii="Times New Roman" w:eastAsia="Times New Roman" w:hAnsi="Times New Roman" w:cs="Times New Roman"/>
-          <w:sz w:val="24"/>
-          <w:szCs w:val="24"/>
-          <w:lang w:eastAsia="pt-BR"/>
-        </w:rPr>
-        <w:t xml:space="preserve">Vetores: </w:t>
-      </w:r>
-    </w:p>
-    <w:p>
-      <w:pPr>
-        <w:numPr>
-          <w:ilvl w:val="1"/>
-          <w:numId w:val="14"/>
-        </w:numPr>
-        <w:spacing w:before="100" w:beforeAutospacing="1" w:after="100" w:afterAutospacing="1" w:line="240" w:lineRule="auto"/>
-        <w:rPr>
-          <w:rFonts w:ascii="Times New Roman" w:eastAsia="Times New Roman" w:hAnsi="Times New Roman" w:cs="Times New Roman"/>
-          <w:sz w:val="24"/>
-          <w:szCs w:val="24"/>
-          <w:lang w:eastAsia="pt-BR"/>
-        </w:rPr>
-      </w:pPr>
-      <w:r>
-        <w:rPr>
-          <w:rFonts w:ascii="Times New Roman" w:eastAsia="Times New Roman" w:hAnsi="Times New Roman" w:cs="Times New Roman"/>
-          <w:sz w:val="24"/>
-          <w:szCs w:val="24"/>
-          <w:lang w:eastAsia="pt-BR"/>
-        </w:rPr>
-        <w:t xml:space="preserve">Armazenar respostas antes de enviar </w:t>
-      </w:r>
-    </w:p>
-    <w:p>
-      <w:pPr>
-        <w:spacing w:before="100" w:beforeAutospacing="1" w:after="100" w:afterAutospacing="1" w:line="240" w:lineRule="auto"/>
-        <w:rPr>
-          <w:rFonts w:ascii="Times New Roman" w:eastAsia="Times New Roman" w:hAnsi="Times New Roman" w:cs="Times New Roman"/>
-          <w:sz w:val="36"/>
-          <w:szCs w:val="36"/>
-          <w:lang w:eastAsia="pt-BR"/>
-        </w:rPr>
-      </w:pPr>
-      <w:r>
-        <w:rPr>
-          <w:rFonts w:ascii="Times New Roman" w:eastAsia="Times New Roman" w:hAnsi="Times New Roman" w:cs="Times New Roman"/>
-          <w:sz w:val="36"/>
-          <w:szCs w:val="36"/>
-          <w:lang w:eastAsia="pt-BR"/>
-        </w:rPr>
-        <w:t>Matemática</w:t>
-      </w:r>
-    </w:p>
-    <w:p>
-      <w:pPr>
-        <w:numPr>
-          <w:ilvl w:val="0"/>
-          <w:numId w:val="16"/>
-        </w:numPr>
-        <w:spacing w:before="100" w:beforeAutospacing="1" w:after="100" w:afterAutospacing="1" w:line="240" w:lineRule="auto"/>
-        <w:rPr>
-          <w:rFonts w:ascii="Times New Roman" w:eastAsia="Times New Roman" w:hAnsi="Times New Roman" w:cs="Times New Roman"/>
-          <w:sz w:val="24"/>
-          <w:szCs w:val="24"/>
-          <w:lang w:eastAsia="pt-BR"/>
-        </w:rPr>
-      </w:pPr>
-      <w:r>
-        <w:rPr>
-          <w:rFonts w:ascii="Times New Roman" w:eastAsia="Times New Roman" w:hAnsi="Times New Roman" w:cs="Times New Roman"/>
-          <w:sz w:val="24"/>
-          <w:szCs w:val="24"/>
-          <w:lang w:eastAsia="pt-BR"/>
-        </w:rPr>
-        <w:t xml:space="preserve">Média: </w:t>
-      </w:r>
-    </w:p>
-    <w:p>
-      <w:pPr>
-        <w:numPr>
-          <w:ilvl w:val="1"/>
-          <w:numId w:val="16"/>
-        </w:numPr>
-        <w:spacing w:before="100" w:beforeAutospacing="1" w:after="100" w:afterAutospacing="1" w:line="240" w:lineRule="auto"/>
-        <w:rPr>
-          <w:rFonts w:ascii="Times New Roman" w:eastAsia="Times New Roman" w:hAnsi="Times New Roman" w:cs="Times New Roman"/>
-          <w:sz w:val="24"/>
-          <w:szCs w:val="24"/>
-          <w:lang w:eastAsia="pt-BR"/>
-        </w:rPr>
-      </w:pPr>
-      <w:r>
-        <w:rPr>
-          <w:rFonts w:ascii="Times New Roman" w:eastAsia="Times New Roman" w:hAnsi="Times New Roman" w:cs="Times New Roman"/>
-          <w:sz w:val="24"/>
-          <w:szCs w:val="24"/>
-          <w:lang w:eastAsia="pt-BR"/>
-        </w:rPr>
-        <w:t xml:space="preserve">idade </w:t>
-      </w:r>
-    </w:p>
-    <w:p>
-      <w:pPr>
-        <w:numPr>
-          <w:ilvl w:val="1"/>
-          <w:numId w:val="16"/>
-        </w:numPr>
-        <w:spacing w:before="100" w:beforeAutospacing="1" w:after="100" w:afterAutospacing="1" w:line="240" w:lineRule="auto"/>
-        <w:rPr>
-          <w:rFonts w:ascii="Times New Roman" w:eastAsia="Times New Roman" w:hAnsi="Times New Roman" w:cs="Times New Roman"/>
-          <w:sz w:val="24"/>
-          <w:szCs w:val="24"/>
-          <w:lang w:eastAsia="pt-BR"/>
-        </w:rPr>
-      </w:pPr>
-      <w:r>
-        <w:rPr>
-          <w:rFonts w:ascii="Times New Roman" w:eastAsia="Times New Roman" w:hAnsi="Times New Roman" w:cs="Times New Roman"/>
-          <w:sz w:val="24"/>
-          <w:szCs w:val="24"/>
-          <w:lang w:eastAsia="pt-BR"/>
-        </w:rPr>
-        <w:t xml:space="preserve">especialidades </w:t>
-      </w:r>
-    </w:p>
-    <w:p>
-      <w:pPr>
-        <w:numPr>
-          <w:ilvl w:val="0"/>
-          <w:numId w:val="16"/>
-        </w:numPr>
-        <w:spacing w:before="100" w:beforeAutospacing="1" w:after="100" w:afterAutospacing="1" w:line="240" w:lineRule="auto"/>
-        <w:rPr>
-          <w:rFonts w:ascii="Times New Roman" w:eastAsia="Times New Roman" w:hAnsi="Times New Roman" w:cs="Times New Roman"/>
-          <w:sz w:val="24"/>
-          <w:szCs w:val="24"/>
-          <w:lang w:eastAsia="pt-BR"/>
-        </w:rPr>
-      </w:pPr>
-      <w:r>
-        <w:rPr>
-          <w:rFonts w:ascii="Times New Roman" w:eastAsia="Times New Roman" w:hAnsi="Times New Roman" w:cs="Times New Roman"/>
-          <w:sz w:val="24"/>
-          <w:szCs w:val="24"/>
-          <w:lang w:eastAsia="pt-BR"/>
-        </w:rPr>
-        <w:t xml:space="preserve">Porcentagem: </w:t>
-      </w:r>
-    </w:p>
-    <w:p>
-      <w:pPr>
-        <w:numPr>
-          <w:ilvl w:val="1"/>
-          <w:numId w:val="16"/>
-        </w:numPr>
-        <w:spacing w:before="100" w:beforeAutospacing="1" w:after="100" w:afterAutospacing="1" w:line="240" w:lineRule="auto"/>
-        <w:rPr>
-          <w:rFonts w:ascii="Times New Roman" w:eastAsia="Times New Roman" w:hAnsi="Times New Roman" w:cs="Times New Roman"/>
-          <w:sz w:val="24"/>
-          <w:szCs w:val="24"/>
-          <w:lang w:eastAsia="pt-BR"/>
-        </w:rPr>
-      </w:pPr>
-      <w:r>
-        <w:rPr>
-          <w:rFonts w:ascii="Times New Roman" w:eastAsia="Times New Roman" w:hAnsi="Times New Roman" w:cs="Times New Roman"/>
-          <w:sz w:val="24"/>
-          <w:szCs w:val="24"/>
-          <w:lang w:eastAsia="pt-BR"/>
-        </w:rPr>
-        <w:t xml:space="preserve">participação </w:t>
-      </w:r>
-    </w:p>
-    <w:p>
-      <w:pPr>
-        <w:numPr>
-          <w:ilvl w:val="0"/>
-          <w:numId w:val="16"/>
-        </w:numPr>
-        <w:spacing w:before="100" w:beforeAutospacing="1" w:after="100" w:afterAutospacing="1" w:line="240" w:lineRule="auto"/>
-        <w:rPr>
-          <w:rFonts w:ascii="Times New Roman" w:eastAsia="Times New Roman" w:hAnsi="Times New Roman" w:cs="Times New Roman"/>
-          <w:sz w:val="24"/>
-          <w:szCs w:val="24"/>
-          <w:lang w:eastAsia="pt-BR"/>
-        </w:rPr>
-      </w:pPr>
-      <w:r>
-        <w:rPr>
-          <w:rFonts w:ascii="Times New Roman" w:eastAsia="Times New Roman" w:hAnsi="Times New Roman" w:cs="Times New Roman"/>
-          <w:sz w:val="24"/>
-          <w:szCs w:val="24"/>
-          <w:lang w:eastAsia="pt-BR"/>
-        </w:rPr>
-        <w:t xml:space="preserve">Crescimento: </w:t>
-      </w:r>
-    </w:p>
-    <w:p>
-      <w:pPr>
-        <w:numPr>
-          <w:ilvl w:val="1"/>
-          <w:numId w:val="16"/>
-        </w:numPr>
-        <w:spacing w:before="100" w:beforeAutospacing="1" w:after="100" w:afterAutospacing="1" w:line="240" w:lineRule="auto"/>
-        <w:rPr>
-          <w:rFonts w:ascii="Times New Roman" w:eastAsia="Times New Roman" w:hAnsi="Times New Roman" w:cs="Times New Roman"/>
-          <w:sz w:val="24"/>
-          <w:szCs w:val="24"/>
-          <w:lang w:eastAsia="pt-BR"/>
-        </w:rPr>
-      </w:pPr>
-      <w:r>
-        <w:rPr>
-          <w:rFonts w:ascii="Times New Roman" w:eastAsia="Times New Roman" w:hAnsi="Times New Roman" w:cs="Times New Roman"/>
-          <w:sz w:val="24"/>
-          <w:szCs w:val="24"/>
-          <w:lang w:eastAsia="pt-BR"/>
-        </w:rPr>
-        <w:t xml:space="preserve">evolução de membros </w:t>
-      </w:r>
-    </w:p>
-    <w:p>
-      <w:pPr>
-        <w:spacing w:before="100" w:beforeAutospacing="1" w:after="100" w:afterAutospacing="1" w:line="240" w:lineRule="auto"/>
-        <w:rPr>
-          <w:rFonts w:ascii="Times New Roman" w:eastAsia="Times New Roman" w:hAnsi="Times New Roman" w:cs="Times New Roman"/>
-          <w:sz w:val="24"/>
-          <w:szCs w:val="24"/>
-          <w:lang w:eastAsia="pt-BR"/>
-        </w:rPr>
-      </w:pPr>
-      <w:r>
-        <w:rPr>
-          <w:rFonts w:ascii="Times New Roman" w:eastAsia="Times New Roman" w:hAnsi="Times New Roman" w:cs="Times New Roman"/>
-          <w:sz w:val="24"/>
-          <w:szCs w:val="24"/>
-          <w:lang w:eastAsia="pt-BR"/>
-        </w:rPr>
-        <w:t>Exemplo:</w:t>
-      </w:r>
-    </w:p>
-    <w:p>
-      <w:pPr>
-        <w:spacing w:before="100" w:beforeAutospacing="1" w:after="100" w:afterAutospacing="1" w:line="240" w:lineRule="auto"/>
-        <w:rPr>
-          <w:rFonts w:ascii="Times New Roman" w:eastAsia="Times New Roman" w:hAnsi="Times New Roman" w:cs="Times New Roman"/>
-          <w:sz w:val="24"/>
-          <w:szCs w:val="24"/>
-          <w:lang w:eastAsia="pt-BR"/>
-        </w:rPr>
-      </w:pPr>
-      <w:r>
-        <w:rPr>
-          <w:rFonts w:ascii="Times New Roman" w:eastAsia="Times New Roman" w:hAnsi="Times New Roman" w:cs="Times New Roman"/>
-          <w:sz w:val="24"/>
-          <w:szCs w:val="24"/>
-          <w:lang w:eastAsia="pt-BR"/>
-        </w:rPr>
-        <w:t>Porcentagem=partetotal×100\</w:t>
-      </w:r>
-      <w:proofErr w:type="spellStart"/>
-      <w:proofErr w:type="gramStart"/>
-      <w:r>
-        <w:rPr>
-          <w:rFonts w:ascii="Times New Roman" w:eastAsia="Times New Roman" w:hAnsi="Times New Roman" w:cs="Times New Roman"/>
-          <w:sz w:val="24"/>
-          <w:szCs w:val="24"/>
-          <w:lang w:eastAsia="pt-BR"/>
-        </w:rPr>
-        <w:t>text</w:t>
-      </w:r>
-      <w:proofErr w:type="spellEnd"/>
-      <w:r>
-        <w:rPr>
-          <w:rFonts w:ascii="Times New Roman" w:eastAsia="Times New Roman" w:hAnsi="Times New Roman" w:cs="Times New Roman"/>
-          <w:sz w:val="24"/>
-          <w:szCs w:val="24"/>
-          <w:lang w:eastAsia="pt-BR"/>
-        </w:rPr>
-        <w:t>{</w:t>
-      </w:r>
-      <w:proofErr w:type="gramEnd"/>
-      <w:r>
-        <w:rPr>
-          <w:rFonts w:ascii="Times New Roman" w:eastAsia="Times New Roman" w:hAnsi="Times New Roman" w:cs="Times New Roman"/>
-          <w:sz w:val="24"/>
-          <w:szCs w:val="24"/>
-          <w:lang w:eastAsia="pt-BR"/>
-        </w:rPr>
-        <w:t>Porcentagem} = \</w:t>
-      </w:r>
-      <w:proofErr w:type="spellStart"/>
-      <w:r>
-        <w:rPr>
-          <w:rFonts w:ascii="Times New Roman" w:eastAsia="Times New Roman" w:hAnsi="Times New Roman" w:cs="Times New Roman"/>
-          <w:sz w:val="24"/>
-          <w:szCs w:val="24"/>
-          <w:lang w:eastAsia="pt-BR"/>
-        </w:rPr>
-        <w:t>frac</w:t>
-      </w:r>
-      <w:proofErr w:type="spellEnd"/>
-      <w:r>
-        <w:rPr>
-          <w:rFonts w:ascii="Times New Roman" w:eastAsia="Times New Roman" w:hAnsi="Times New Roman" w:cs="Times New Roman"/>
-          <w:sz w:val="24"/>
-          <w:szCs w:val="24"/>
-          <w:lang w:eastAsia="pt-BR"/>
-        </w:rPr>
-        <w:t>{\</w:t>
-      </w:r>
-      <w:proofErr w:type="spellStart"/>
-      <w:r>
-        <w:rPr>
-          <w:rFonts w:ascii="Times New Roman" w:eastAsia="Times New Roman" w:hAnsi="Times New Roman" w:cs="Times New Roman"/>
-          <w:sz w:val="24"/>
-          <w:szCs w:val="24"/>
-          <w:lang w:eastAsia="pt-BR"/>
-        </w:rPr>
-        <w:t>text</w:t>
-      </w:r>
-      <w:proofErr w:type="spellEnd"/>
-      <w:r>
-        <w:rPr>
-          <w:rFonts w:ascii="Times New Roman" w:eastAsia="Times New Roman" w:hAnsi="Times New Roman" w:cs="Times New Roman"/>
-          <w:sz w:val="24"/>
-          <w:szCs w:val="24"/>
-          <w:lang w:eastAsia="pt-BR"/>
-        </w:rPr>
-        <w:t>{parte}}{\</w:t>
-      </w:r>
-      <w:proofErr w:type="spellStart"/>
-      <w:r>
-        <w:rPr>
-          <w:rFonts w:ascii="Times New Roman" w:eastAsia="Times New Roman" w:hAnsi="Times New Roman" w:cs="Times New Roman"/>
-          <w:sz w:val="24"/>
-          <w:szCs w:val="24"/>
-          <w:lang w:eastAsia="pt-BR"/>
-        </w:rPr>
-        <w:t>text</w:t>
-      </w:r>
-      <w:proofErr w:type="spellEnd"/>
-      <w:r>
-        <w:rPr>
-          <w:rFonts w:ascii="Times New Roman" w:eastAsia="Times New Roman" w:hAnsi="Times New Roman" w:cs="Times New Roman"/>
-          <w:sz w:val="24"/>
-          <w:szCs w:val="24"/>
-          <w:lang w:eastAsia="pt-BR"/>
-        </w:rPr>
-        <w:t>{total}} \times 100Porcentagem=</w:t>
-      </w:r>
-      <w:proofErr w:type="spellStart"/>
-      <w:r>
-        <w:rPr>
-          <w:rFonts w:ascii="Times New Roman" w:eastAsia="Times New Roman" w:hAnsi="Times New Roman" w:cs="Times New Roman"/>
-          <w:sz w:val="24"/>
-          <w:szCs w:val="24"/>
-          <w:lang w:eastAsia="pt-BR"/>
-        </w:rPr>
-        <w:t>totalparte</w:t>
-      </w:r>
-      <w:proofErr w:type="spellEnd"/>
-      <w:r>
-        <w:rPr>
-          <w:rFonts w:ascii="Times New Roman" w:eastAsia="Times New Roman" w:hAnsi="Times New Roman" w:cs="Times New Roman"/>
-          <w:sz w:val="24"/>
-          <w:szCs w:val="24"/>
-          <w:lang w:eastAsia="pt-BR"/>
-        </w:rPr>
-        <w:t>​×100</w:t>
-      </w:r>
-    </w:p>
-    <w:p/>
+      <w:bookmarkStart w:id="0" w:name="_GoBack"/>
+      <w:bookmarkEnd w:id="0"/>
+    </w:p>
     <w:sectPr>
       <w:pgSz w:w="11906" w:h="16838"/>
       <w:pgMar w:top="1417" w:right="1701" w:bottom="1417" w:left="1701" w:header="708" w:footer="708" w:gutter="0"/>

</xml_diff>

<commit_message>
Ajustes na estilização das páginas e elementos mal formulados.
</commit_message>
<xml_diff>
--- a/artefatos/Documentacao.docx
+++ b/artefatos/Documentacao.docx
@@ -225,6 +225,62 @@
       </w:pPr>
       <w:r>
         <w:rPr>
+          <w:rFonts w:ascii="Times New Roman" w:hAnsi="Times New Roman" w:cs="Times New Roman"/>
+          <w:sz w:val="24"/>
+          <w:szCs w:val="24"/>
+        </w:rPr>
+        <w:t xml:space="preserve">O presente trabalho está alinhado ao </w:t>
+      </w:r>
+      <w:r>
+        <w:rPr>
+          <w:rStyle w:val="Forte"/>
+          <w:rFonts w:ascii="Times New Roman" w:hAnsi="Times New Roman" w:cs="Times New Roman"/>
+          <w:b w:val="0"/>
+          <w:sz w:val="24"/>
+          <w:szCs w:val="24"/>
+        </w:rPr>
+        <w:t>Objetivo de Desenvolvimento Sustentável 4 (Educação de Qualidade)</w:t>
+      </w:r>
+      <w:r>
+        <w:rPr>
+          <w:rFonts w:ascii="Times New Roman" w:hAnsi="Times New Roman" w:cs="Times New Roman"/>
+          <w:b/>
+          <w:sz w:val="24"/>
+          <w:szCs w:val="24"/>
+        </w:rPr>
+        <w:t>,</w:t>
+      </w:r>
+      <w:r>
+        <w:rPr>
+          <w:rFonts w:ascii="Times New Roman" w:hAnsi="Times New Roman" w:cs="Times New Roman"/>
+          <w:sz w:val="24"/>
+          <w:szCs w:val="24"/>
+        </w:rPr>
+        <w:t xml:space="preserve"> proposto pela Organização das Nações Unidas (ONU). O Clube de Desbravadores contribui para esse objetivo ao promover a educação complementar de crianças e adolescent</w:t>
+      </w:r>
+      <w:bookmarkStart w:id="0" w:name="_GoBack"/>
+      <w:bookmarkEnd w:id="0"/>
+      <w:r>
+        <w:rPr>
+          <w:rFonts w:ascii="Times New Roman" w:hAnsi="Times New Roman" w:cs="Times New Roman"/>
+          <w:sz w:val="24"/>
+          <w:szCs w:val="24"/>
+        </w:rPr>
+        <w:t>es por meio de atividades práticas, desenvolvimento de habilidades, incentivo à cidadania, trabalho em equipe, liderança e respeito ao próximo. Além do aprendizado adquirido em especialidades, acampamentos e projetos comunitários, os participantes desenvolvem valores éticos e sociais que colaboram para sua formação integral, preparando-os para atuar de maneira responsável na sociedade.</w:t>
+      </w:r>
+    </w:p>
+    <w:p>
+      <w:pPr>
+        <w:spacing w:before="100" w:beforeAutospacing="1" w:after="100" w:afterAutospacing="1" w:line="240" w:lineRule="auto"/>
+        <w:rPr>
+          <w:rFonts w:ascii="Times New Roman" w:eastAsia="Times New Roman" w:hAnsi="Times New Roman" w:cs="Times New Roman"/>
+          <w:sz w:val="24"/>
+          <w:szCs w:val="24"/>
+          <w:lang w:eastAsia="pt-BR"/>
+        </w:rPr>
+      </w:pPr>
+      <w:r>
+        <w:rPr>
           <w:rFonts w:ascii="Times New Roman" w:eastAsia="Times New Roman" w:hAnsi="Times New Roman" w:cs="Times New Roman"/>
           <w:sz w:val="24"/>
           <w:szCs w:val="24"/>
@@ -314,7 +370,11 @@
         <w:t>responsabilidade</w:t>
       </w:r>
       <w:r>
-        <w:t xml:space="preserve">, cultivada desde cedo ao assumir tarefas que impactavam outras pessoas. A </w:t>
+        <w:t xml:space="preserve">, cultivada desde cedo ao </w:t>
+      </w:r>
+      <w:r>
+        <w:lastRenderedPageBreak/>
+        <w:t xml:space="preserve">assumir tarefas que impactavam outras pessoas. A </w:t>
       </w:r>
       <w:r>
         <w:rPr>
@@ -374,7 +434,6 @@
         <w:t xml:space="preserve">fundamentalmente a </w:t>
       </w:r>
       <w:r>
-        <w:lastRenderedPageBreak/>
         <w:t>disciplina. Curiosamente, essa limitação acabou se tornando um reflexo direto de um dos valores mais presentes na minha trajetória</w:t>
       </w:r>
       <w:r>
@@ -639,6 +698,7 @@
           <w:sz w:val="24"/>
           <w:szCs w:val="24"/>
         </w:rPr>
+        <w:lastRenderedPageBreak/>
         <w:t>Do ponto de vista acadêmico, o projeto também se justifica pela oportunidade de aplicar, de maneira integrada, os conteúdos estudados nas disciplinas do curso, como modelagem de banco de dados, desenvolvimento de algoritmos, uso de ferramentas de versionamento, planejamento de projeto e utilização de ambientes Linux. Dessa forma, além de atender aos requisitos acadêmicos, o sistema desenvolvido permitirá colocar em prática conhecimentos técnicos em um contexto significativo e próximo da realidade, podendo ainda servir como base para futuras melhorias e aplicações reais em ambientes semelhantes.</w:t>
       </w:r>
     </w:p>
@@ -682,7 +742,6 @@
           <w:b/>
           <w:lang w:eastAsia="pt-BR"/>
         </w:rPr>
-        <w:lastRenderedPageBreak/>
         <w:t>3.1 Descrição resumida</w:t>
       </w:r>
     </w:p>
@@ -1144,7 +1203,6 @@
           <w:sz w:val="24"/>
           <w:szCs w:val="24"/>
         </w:rPr>
-        <w:lastRenderedPageBreak/>
         <w:t xml:space="preserve">O sistema deve possuir um </w:t>
       </w:r>
       <w:r>
@@ -1649,6 +1707,7 @@
           <w:b/>
           <w:lang w:eastAsia="pt-BR"/>
         </w:rPr>
+        <w:lastRenderedPageBreak/>
         <w:t xml:space="preserve">3.4 </w:t>
       </w:r>
       <w:r>
@@ -1678,7 +1737,6 @@
           <w:noProof/>
           <w:lang w:eastAsia="pt-BR"/>
         </w:rPr>
-        <w:lastRenderedPageBreak/>
         <w:drawing>
           <wp:inline distT="0" distB="0" distL="0" distR="0" wp14:anchorId="5CCF6BD1" wp14:editId="2FD01676">
             <wp:extent cx="5400040" cy="3452495"/>
@@ -2482,7 +2540,6 @@
           <w:b/>
           <w:lang w:eastAsia="pt-BR"/>
         </w:rPr>
-        <w:lastRenderedPageBreak/>
         <w:t>3.</w:t>
       </w:r>
       <w:r>
@@ -4638,10 +4695,7 @@
         </w:rPr>
       </w:pPr>
     </w:p>
-    <w:p>
-      <w:bookmarkStart w:id="0" w:name="_GoBack"/>
-      <w:bookmarkEnd w:id="0"/>
-    </w:p>
+    <w:p/>
     <w:sectPr>
       <w:pgSz w:w="11906" w:h="16838"/>
       <w:pgMar w:top="1417" w:right="1701" w:bottom="1417" w:left="1701" w:header="708" w:footer="708" w:gutter="0"/>

</xml_diff>